<commit_message>
docs: update DOCUMENTATION.docx, .md, and .txt with beginner-friendly system guide, new workflows, and all APIs
</commit_message>
<xml_diff>
--- a/DOCUMENTATION.docx
+++ b/DOCUMENTATION.docx
@@ -4,28 +4,27 @@
   <w:body>
     <w:p>
       <w:pPr>
-        <w:jc w:val="center"/>
+        <w:jc w:val="left"/>
       </w:pPr>
       <w:r>
         <w:rPr>
+          <w:rFonts w:ascii="Calibri" w:hAnsi="Calibri"/>
           <w:b/>
-          <w:color w:val="1B365D"/>
+          <w:color w:val="0F172A"/>
           <w:sz w:val="44"/>
         </w:rPr>
-        <w:t>Landslide Early Warning &amp; Risk Monitoring System</w:t>
+        <w:t>North Eastern Region (NER) Landslide Early Warning &amp; Risk Monitoring System</w:t>
       </w:r>
     </w:p>
     <w:p>
-      <w:pPr>
-        <w:jc w:val="center"/>
-      </w:pPr>
       <w:r>
         <w:rPr>
-          <w:i/>
-          <w:color w:val="556677"/>
-          <w:sz w:val="26"/>
+          <w:rFonts w:ascii="Calibri" w:hAnsi="Calibri"/>
+          <w:b/>
+          <w:color w:val="D97706"/>
+          <w:sz w:val="24"/>
         </w:rPr>
-        <w:t>Complete System Guide: How It Works, Flowchart, Tech Stack &amp; APIs</w:t>
+        <w:t>Complete Beginner-Friendly System Guide, End-to-End Workflows, Features, APIs &amp; Database Setup</w:t>
       </w:r>
     </w:p>
     <w:p>
@@ -35,765 +34,809 @@
     </w:p>
     <w:p>
       <w:pPr>
-        <w:pStyle w:val="Heading1"/>
+        <w:spacing w:before="360" w:after="120"/>
       </w:pPr>
       <w:r>
         <w:rPr>
-          <w:color w:val="1B365D"/>
-          <w:sz w:val="32"/>
+          <w:rFonts w:ascii="Calibri" w:hAnsi="Calibri"/>
+          <w:b/>
+          <w:color w:val="1E3A8A"/>
+          <w:sz w:val="30"/>
         </w:rPr>
-        <w:t>1. What is this Project?</w:t>
+        <w:t>1. What is this Project in Simple Words?</w:t>
       </w:r>
     </w:p>
     <w:p>
       <w:r>
-        <w:t>The Landslide Early Warning &amp; Risk Monitoring System is a web platform built to protect people living in the hilly areas of North East India (such as Meghalaya, Assam, Mizoram, Nagaland, and Arunachal Pradesh).</w:t>
-        <w:br/>
-        <w:br/>
-        <w:t>In these regions, heavy rainfall during monsoon seasons frequently triggers dangerous landslides and road blockages. This platform solves that problem by:</w:t>
+        <w:t>In the North Eastern States of India (such as Meghalaya, Assam, Mizoram, Nagaland, Arunachal Pradesh, Sikkim, Manipur, and Tripura), heavy monsoon rains frequently cause dangerous mountain landslides, hill collapses, and blocked highways. When a landslide happens, entire villages can be cut off from food, water, and medical supplies.</w:t>
+      </w:r>
+    </w:p>
+    <w:p>
+      <w:r>
+        <w:t>This platform is a smart early warning web system. It combines satellite pictures, ground moisture sensors, and Artificial Intelligence (AI) to predict dangerous landslides before they happen and instantly warn people so they can safely evacuate in time.</w:t>
       </w:r>
     </w:p>
     <w:p>
       <w:pPr>
         <w:pStyle w:val="ListBullet"/>
+        <w:spacing w:after="60"/>
       </w:pPr>
       <w:r>
         <w:rPr>
           <w:b/>
-          <w:color w:val="1B365D"/>
+          <w:color w:val="0F172A"/>
         </w:rPr>
-        <w:t xml:space="preserve">Allowing Citizens to Report Incidents: </w:t>
+        <w:t xml:space="preserve">Citizen Incident Reporting: </w:t>
       </w:r>
       <w:r>
-        <w:t>Anyone can take a picture of a landslide or road crack, tag their GPS location, and send it immediately to authorities.</w:t>
+        <w:rPr>
+          <w:color w:val="334155"/>
+        </w:rPr>
+        <w:t>Anyone with a mobile phone can take a photo of a crack or landslide, tag their GPS location, and send it directly to emergency control rooms.</w:t>
       </w:r>
     </w:p>
     <w:p>
       <w:pPr>
         <w:pStyle w:val="ListBullet"/>
+        <w:spacing w:after="60"/>
       </w:pPr>
       <w:r>
         <w:rPr>
           <w:b/>
-          <w:color w:val="1B365D"/>
+          <w:color w:val="0F172A"/>
         </w:rPr>
-        <w:t xml:space="preserve">Helping Officers Verify Reports: </w:t>
+        <w:t xml:space="preserve">Officer Verification: </w:t>
       </w:r>
       <w:r>
-        <w:t>Disaster management teams can review the photos and confirm whether the danger is real.</w:t>
+        <w:rPr>
+          <w:color w:val="334155"/>
+        </w:rPr>
+        <w:t>Disaster management officers review reports on their screen, check photos, and click one button to approve or reject them.</w:t>
       </w:r>
     </w:p>
     <w:p>
       <w:pPr>
         <w:pStyle w:val="ListBullet"/>
+        <w:spacing w:after="60"/>
       </w:pPr>
       <w:r>
         <w:rPr>
           <w:b/>
-          <w:color w:val="1B365D"/>
+          <w:color w:val="0F172A"/>
         </w:rPr>
-        <w:t xml:space="preserve">Using AI to Predict Landslide Risk: </w:t>
+        <w:t xml:space="preserve">Smart AI Risk Prediction: </w:t>
       </w:r>
       <w:r>
-        <w:t>The system looks at current rainfall, soil wetness, how steep the mountain is, and past landslide history to calculate a risk level (Low, Medium, High, or Critical).</w:t>
+        <w:rPr>
+          <w:color w:val="334155"/>
+        </w:rPr>
+        <w:t>The AI checks rain amount, ground wetness, slope steepness, and past history to give a simple risk rating: Low, Medium, High, or Critical.</w:t>
       </w:r>
     </w:p>
     <w:p>
       <w:pPr>
         <w:pStyle w:val="ListBullet"/>
+        <w:spacing w:after="60"/>
       </w:pPr>
       <w:r>
         <w:rPr>
           <w:b/>
-          <w:color w:val="1B365D"/>
+          <w:color w:val="0F172A"/>
         </w:rPr>
-        <w:t xml:space="preserve">Sending Instant Emergency Alerts: </w:t>
+        <w:t xml:space="preserve">Emergency Pop-Up Alert Box: </w:t>
       </w:r>
       <w:r>
-        <w:t>If a landslide is confirmed or risk is critical, the system sends SMS warnings and push notifications to people and district officers.</w:t>
-      </w:r>
-    </w:p>
-    <w:p>
-      <w:pPr>
-        <w:spacing w:after="200"/>
-      </w:pPr>
-    </w:p>
-    <w:p>
-      <w:pPr>
-        <w:pStyle w:val="Heading1"/>
-      </w:pPr>
-      <w:r>
         <w:rPr>
-          <w:color w:val="1B365D"/>
-          <w:sz w:val="32"/>
+          <w:color w:val="334155"/>
         </w:rPr>
-        <w:t>2. How the System Works (End-to-End Workflow)</w:t>
-      </w:r>
-    </w:p>
-    <w:p>
-      <w:r>
-        <w:t>Here is how the entire system works from the moment a danger appears to when people receive emergency alerts:</w:t>
-      </w:r>
-    </w:p>
-    <w:tbl>
-      <w:tblPr>
-        <w:tblW w:type="auto" w:w="0"/>
-        <w:jc w:val="center"/>
-        <w:tblLook w:firstColumn="1" w:firstRow="1" w:lastColumn="0" w:lastRow="0" w:noHBand="0" w:noVBand="1" w:val="04A0"/>
-      </w:tblPr>
-      <w:tblGrid>
-        <w:gridCol w:w="4968"/>
-        <w:gridCol w:w="4968"/>
-      </w:tblGrid>
-      <w:tr>
-        <w:tc>
-          <w:tcPr>
-            <w:tcW w:type="dxa" w:w="4968"/>
-            <w:shd w:fill="1B365D"/>
-            <w:tcMar>
-              <w:top w:w="120" w:type="dxa"/>
-              <w:bottom w:w="120" w:type="dxa"/>
-              <w:left w:w="150" w:type="dxa"/>
-              <w:right w:w="150" w:type="dxa"/>
-            </w:tcMar>
-          </w:tcPr>
-          <w:p>
-            <w:r>
-              <w:rPr>
-                <w:b/>
-                <w:color w:val="FFFFFF"/>
-              </w:rPr>
-              <w:t>Flowchart Stage</w:t>
-            </w:r>
-          </w:p>
-        </w:tc>
-        <w:tc>
-          <w:tcPr>
-            <w:tcW w:type="dxa" w:w="4968"/>
-            <w:shd w:fill="1B365D"/>
-            <w:tcMar>
-              <w:top w:w="120" w:type="dxa"/>
-              <w:bottom w:w="120" w:type="dxa"/>
-              <w:left w:w="150" w:type="dxa"/>
-              <w:right w:w="150" w:type="dxa"/>
-            </w:tcMar>
-          </w:tcPr>
-          <w:p>
-            <w:r>
-              <w:rPr>
-                <w:b/>
-                <w:color w:val="FFFFFF"/>
-              </w:rPr>
-              <w:t>What Happens</w:t>
-            </w:r>
-          </w:p>
-        </w:tc>
-      </w:tr>
-      <w:tr>
-        <w:tc>
-          <w:tcPr>
-            <w:tcW w:type="dxa" w:w="4968"/>
-            <w:shd w:fill="E8F1F5"/>
-            <w:tcMar>
-              <w:top w:w="100" w:type="dxa"/>
-              <w:bottom w:w="100" w:type="dxa"/>
-              <w:left w:w="150" w:type="dxa"/>
-              <w:right w:w="150" w:type="dxa"/>
-            </w:tcMar>
-          </w:tcPr>
-          <w:p>
-            <w:r>
-              <w:rPr>
-                <w:b/>
-                <w:color w:val="1B365D"/>
-              </w:rPr>
-              <w:t>Step 1: Danger Detected</w:t>
-            </w:r>
-          </w:p>
-        </w:tc>
-        <w:tc>
-          <w:tcPr>
-            <w:tcW w:type="dxa" w:w="4968"/>
-            <w:shd w:fill="FAFAFA"/>
-            <w:tcMar>
-              <w:top w:w="100" w:type="dxa"/>
-              <w:bottom w:w="100" w:type="dxa"/>
-              <w:left w:w="150" w:type="dxa"/>
-              <w:right w:w="150" w:type="dxa"/>
-            </w:tcMar>
-          </w:tcPr>
-          <w:p>
-            <w:r>
-              <w:t>Landslide, mountain crack, road blockage, or heavy rain is observed.</w:t>
-            </w:r>
-          </w:p>
-        </w:tc>
-      </w:tr>
-      <w:tr>
-        <w:tc>
-          <w:tcPr>
-            <w:tcW w:type="dxa" w:w="4968"/>
-            <w:shd w:fill="D4E6F1"/>
-            <w:tcMar>
-              <w:top w:w="100" w:type="dxa"/>
-              <w:bottom w:w="100" w:type="dxa"/>
-              <w:left w:w="150" w:type="dxa"/>
-              <w:right w:w="150" w:type="dxa"/>
-            </w:tcMar>
-          </w:tcPr>
-          <w:p>
-            <w:r>
-              <w:rPr>
-                <w:b/>
-                <w:color w:val="1B365D"/>
-              </w:rPr>
-              <w:t>Step 2: Citizen Reports</w:t>
-            </w:r>
-          </w:p>
-        </w:tc>
-        <w:tc>
-          <w:tcPr>
-            <w:tcW w:type="dxa" w:w="4968"/>
-            <w:shd w:fill="FAFAFA"/>
-            <w:tcMar>
-              <w:top w:w="100" w:type="dxa"/>
-              <w:bottom w:w="100" w:type="dxa"/>
-              <w:left w:w="150" w:type="dxa"/>
-              <w:right w:w="150" w:type="dxa"/>
-            </w:tcMar>
-          </w:tcPr>
-          <w:p>
-            <w:r>
-              <w:t>User takes photo/video, captures GPS coordinates, and submits form.</w:t>
-            </w:r>
-          </w:p>
-        </w:tc>
-      </w:tr>
-      <w:tr>
-        <w:tc>
-          <w:tcPr>
-            <w:tcW w:type="dxa" w:w="4968"/>
-            <w:shd w:fill="E8F1F5"/>
-            <w:tcMar>
-              <w:top w:w="100" w:type="dxa"/>
-              <w:bottom w:w="100" w:type="dxa"/>
-              <w:left w:w="150" w:type="dxa"/>
-              <w:right w:w="150" w:type="dxa"/>
-            </w:tcMar>
-          </w:tcPr>
-          <w:p>
-            <w:r>
-              <w:rPr>
-                <w:b/>
-                <w:color w:val="1B365D"/>
-              </w:rPr>
-              <w:t>Step 3: Data &amp; Media Saved</w:t>
-            </w:r>
-          </w:p>
-        </w:tc>
-        <w:tc>
-          <w:tcPr>
-            <w:tcW w:type="dxa" w:w="4968"/>
-            <w:shd w:fill="FAFAFA"/>
-            <w:tcMar>
-              <w:top w:w="100" w:type="dxa"/>
-              <w:bottom w:w="100" w:type="dxa"/>
-              <w:left w:w="150" w:type="dxa"/>
-              <w:right w:w="150" w:type="dxa"/>
-            </w:tcMar>
-          </w:tcPr>
-          <w:p>
-            <w:r>
-              <w:t>Photo saved to cloud storage; report created with status 'Pending'.</w:t>
-            </w:r>
-          </w:p>
-        </w:tc>
-      </w:tr>
-      <w:tr>
-        <w:tc>
-          <w:tcPr>
-            <w:tcW w:type="dxa" w:w="4968"/>
-            <w:shd w:fill="D4E6F1"/>
-            <w:tcMar>
-              <w:top w:w="100" w:type="dxa"/>
-              <w:bottom w:w="100" w:type="dxa"/>
-              <w:left w:w="150" w:type="dxa"/>
-              <w:right w:w="150" w:type="dxa"/>
-            </w:tcMar>
-          </w:tcPr>
-          <w:p>
-            <w:r>
-              <w:rPr>
-                <w:b/>
-                <w:color w:val="1B365D"/>
-              </w:rPr>
-              <w:t>Step 4: Control Room Alert</w:t>
-            </w:r>
-          </w:p>
-        </w:tc>
-        <w:tc>
-          <w:tcPr>
-            <w:tcW w:type="dxa" w:w="4968"/>
-            <w:shd w:fill="FAFAFA"/>
-            <w:tcMar>
-              <w:top w:w="100" w:type="dxa"/>
-              <w:bottom w:w="100" w:type="dxa"/>
-              <w:left w:w="150" w:type="dxa"/>
-              <w:right w:w="150" w:type="dxa"/>
-            </w:tcMar>
-          </w:tcPr>
-          <w:p>
-            <w:r>
-              <w:t>Disaster management control room receives immediate notification.</w:t>
-            </w:r>
-          </w:p>
-        </w:tc>
-      </w:tr>
-      <w:tr>
-        <w:tc>
-          <w:tcPr>
-            <w:tcW w:type="dxa" w:w="4968"/>
-            <w:shd w:fill="FEF9E7"/>
-            <w:tcMar>
-              <w:top w:w="100" w:type="dxa"/>
-              <w:bottom w:w="100" w:type="dxa"/>
-              <w:left w:w="150" w:type="dxa"/>
-              <w:right w:w="150" w:type="dxa"/>
-            </w:tcMar>
-          </w:tcPr>
-          <w:p>
-            <w:r>
-              <w:rPr>
-                <w:b/>
-                <w:color w:val="1B365D"/>
-              </w:rPr>
-              <w:t>Step 5: Officer Verification</w:t>
-            </w:r>
-          </w:p>
-        </w:tc>
-        <w:tc>
-          <w:tcPr>
-            <w:tcW w:type="dxa" w:w="4968"/>
-            <w:shd w:fill="FAFAFA"/>
-            <w:tcMar>
-              <w:top w:w="100" w:type="dxa"/>
-              <w:bottom w:w="100" w:type="dxa"/>
-              <w:left w:w="150" w:type="dxa"/>
-              <w:right w:w="150" w:type="dxa"/>
-            </w:tcMar>
-          </w:tcPr>
-          <w:p>
-            <w:r>
-              <w:t>Officer inspects photo and GPS on map: either 'Verify' or 'Reject'.</w:t>
-            </w:r>
-          </w:p>
-        </w:tc>
-      </w:tr>
-      <w:tr>
-        <w:tc>
-          <w:tcPr>
-            <w:tcW w:type="dxa" w:w="4968"/>
-            <w:shd w:fill="E8F8F5"/>
-            <w:tcMar>
-              <w:top w:w="100" w:type="dxa"/>
-              <w:bottom w:w="100" w:type="dxa"/>
-              <w:left w:w="150" w:type="dxa"/>
-              <w:right w:w="150" w:type="dxa"/>
-            </w:tcMar>
-          </w:tcPr>
-          <w:p>
-            <w:r>
-              <w:rPr>
-                <w:b/>
-                <w:color w:val="1B365D"/>
-              </w:rPr>
-              <w:t>Step 6: AI Risk Calculation</w:t>
-            </w:r>
-          </w:p>
-        </w:tc>
-        <w:tc>
-          <w:tcPr>
-            <w:tcW w:type="dxa" w:w="4968"/>
-            <w:shd w:fill="FAFAFA"/>
-            <w:tcMar>
-              <w:top w:w="100" w:type="dxa"/>
-              <w:bottom w:w="100" w:type="dxa"/>
-              <w:left w:w="150" w:type="dxa"/>
-              <w:right w:w="150" w:type="dxa"/>
-            </w:tcMar>
-          </w:tcPr>
-          <w:p>
-            <w:r>
-              <w:t>AI evaluates 24h rainfall, soil wetness, slope angle, and past history.</w:t>
-            </w:r>
-          </w:p>
-        </w:tc>
-      </w:tr>
-      <w:tr>
-        <w:tc>
-          <w:tcPr>
-            <w:tcW w:type="dxa" w:w="4968"/>
-            <w:shd w:fill="E8F8F5"/>
-            <w:tcMar>
-              <w:top w:w="100" w:type="dxa"/>
-              <w:bottom w:w="100" w:type="dxa"/>
-              <w:left w:w="150" w:type="dxa"/>
-              <w:right w:w="150" w:type="dxa"/>
-            </w:tcMar>
-          </w:tcPr>
-          <w:p>
-            <w:r>
-              <w:rPr>
-                <w:b/>
-                <w:color w:val="1B365D"/>
-              </w:rPr>
-              <w:t>Step 7: Hazard Level Assigned</w:t>
-            </w:r>
-          </w:p>
-        </w:tc>
-        <w:tc>
-          <w:tcPr>
-            <w:tcW w:type="dxa" w:w="4968"/>
-            <w:shd w:fill="FAFAFA"/>
-            <w:tcMar>
-              <w:top w:w="100" w:type="dxa"/>
-              <w:bottom w:w="100" w:type="dxa"/>
-              <w:left w:w="150" w:type="dxa"/>
-              <w:right w:w="150" w:type="dxa"/>
-            </w:tcMar>
-          </w:tcPr>
-          <w:p>
-            <w:r>
-              <w:t>Risk categorized clearly as Low, Medium, High, or Critical.</w:t>
-            </w:r>
-          </w:p>
-        </w:tc>
-      </w:tr>
-      <w:tr>
-        <w:tc>
-          <w:tcPr>
-            <w:tcW w:type="dxa" w:w="4968"/>
-            <w:shd w:fill="FADBD8"/>
-            <w:tcMar>
-              <w:top w:w="100" w:type="dxa"/>
-              <w:bottom w:w="100" w:type="dxa"/>
-              <w:left w:w="150" w:type="dxa"/>
-              <w:right w:w="150" w:type="dxa"/>
-            </w:tcMar>
-          </w:tcPr>
-          <w:p>
-            <w:r>
-              <w:rPr>
-                <w:b/>
-                <w:color w:val="1B365D"/>
-              </w:rPr>
-              <w:t>Step 8: Alerts Dispatched</w:t>
-            </w:r>
-          </w:p>
-        </w:tc>
-        <w:tc>
-          <w:tcPr>
-            <w:tcW w:type="dxa" w:w="4968"/>
-            <w:shd w:fill="FAFAFA"/>
-            <w:tcMar>
-              <w:top w:w="100" w:type="dxa"/>
-              <w:bottom w:w="100" w:type="dxa"/>
-              <w:left w:w="150" w:type="dxa"/>
-              <w:right w:w="150" w:type="dxa"/>
-            </w:tcMar>
-          </w:tcPr>
-          <w:p>
-            <w:r>
-              <w:t>Emergency SMS, push notifications, and emails sent to district.</w:t>
-            </w:r>
-          </w:p>
-        </w:tc>
-      </w:tr>
-      <w:tr>
-        <w:tc>
-          <w:tcPr>
-            <w:tcW w:type="dxa" w:w="4968"/>
-            <w:shd w:fill="D5F5E3"/>
-            <w:tcMar>
-              <w:top w:w="100" w:type="dxa"/>
-              <w:bottom w:w="100" w:type="dxa"/>
-              <w:left w:w="150" w:type="dxa"/>
-              <w:right w:w="150" w:type="dxa"/>
-            </w:tcMar>
-          </w:tcPr>
-          <w:p>
-            <w:r>
-              <w:rPr>
-                <w:b/>
-                <w:color w:val="1B365D"/>
-              </w:rPr>
-              <w:t>Step 9: Live Map Updated</w:t>
-            </w:r>
-          </w:p>
-        </w:tc>
-        <w:tc>
-          <w:tcPr>
-            <w:tcW w:type="dxa" w:w="4968"/>
-            <w:shd w:fill="FAFAFA"/>
-            <w:tcMar>
-              <w:top w:w="100" w:type="dxa"/>
-              <w:bottom w:w="100" w:type="dxa"/>
-              <w:left w:w="150" w:type="dxa"/>
-              <w:right w:w="150" w:type="dxa"/>
-            </w:tcMar>
-          </w:tcPr>
-          <w:p>
-            <w:r>
-              <w:t>Interactive map displays danger pin; statistics update on dashboard.</w:t>
-            </w:r>
-          </w:p>
-        </w:tc>
-      </w:tr>
-    </w:tbl>
-    <w:p>
-      <w:pPr>
-        <w:spacing w:after="240"/>
-      </w:pPr>
-    </w:p>
-    <w:p>
-      <w:pPr>
-        <w:pStyle w:val="Heading2"/>
-      </w:pPr>
-      <w:r>
-        <w:t>Step-by-Step Sub-Workflows</w:t>
-      </w:r>
-    </w:p>
-    <w:p>
-      <w:r>
-        <w:rPr>
-          <w:b/>
-          <w:color w:val="2C3E50"/>
-          <w:sz w:val="24"/>
-        </w:rPr>
-        <w:t>A. Citizen Reporting Workflow</w:t>
+        <w:t>If danger is extreme, a loud red warning box immediately pops up on screen with step-by-step instructions and a direct 1-tap call to the 1070 disaster helpline.</w:t>
       </w:r>
     </w:p>
     <w:p>
       <w:pPr>
         <w:pStyle w:val="ListBullet"/>
+        <w:spacing w:after="60"/>
       </w:pPr>
       <w:r>
-        <w:t>A citizen or field agent opens the 'Report Incident' page on their mobile or desktop.</w:t>
+        <w:rPr>
+          <w:b/>
+          <w:color w:val="0F172A"/>
+        </w:rPr>
+        <w:t xml:space="preserve">Public Live GIS Map &amp; Weather: </w:t>
+      </w:r>
+      <w:r>
+        <w:rPr>
+          <w:color w:val="334155"/>
+        </w:rPr>
+        <w:t>Anyone can see live landslide risk pins across North East India and view 7-day rainfall forecasts without needing to sign in.</w:t>
+      </w:r>
+    </w:p>
+    <w:p>
+      <w:pPr>
+        <w:spacing w:before="360" w:after="120"/>
+      </w:pPr>
+      <w:r>
+        <w:rPr>
+          <w:rFonts w:ascii="Calibri" w:hAnsi="Calibri"/>
+          <w:b/>
+          <w:color w:val="1E3A8A"/>
+          <w:sz w:val="30"/>
+        </w:rPr>
+        <w:t>2. How the Complete System Works (Step-by-Step Workflow)</w:t>
+      </w:r>
+    </w:p>
+    <w:p>
+      <w:r>
+        <w:t>Here is the complete step-by-step journey from when heavy rain starts to when people receive emergency evacuation warnings:</w:t>
+      </w:r>
+    </w:p>
+    <w:p>
+      <w:pPr>
+        <w:spacing w:before="240" w:after="80"/>
+      </w:pPr>
+      <w:r>
+        <w:rPr>
+          <w:rFonts w:ascii="Calibri" w:hAnsi="Calibri"/>
+          <w:b/>
+          <w:color w:val="0F172A"/>
+          <w:sz w:val="25"/>
+        </w:rPr>
+        <w:t>Step 1: Rain &amp; Ground Sensors Collect Live Data</w:t>
+      </w:r>
+    </w:p>
+    <w:p>
+      <w:r>
+        <w:t>Every 15 minutes, weather radars and underground sensors measure how much rain has fallen and how wet the soil is. If a mountain slope gets too saturated with water, the ground becomes heavy and loose like mud, making it ready to slide.</w:t>
+      </w:r>
+    </w:p>
+    <w:p>
+      <w:pPr>
+        <w:spacing w:before="240" w:after="80"/>
+      </w:pPr>
+      <w:r>
+        <w:rPr>
+          <w:rFonts w:ascii="Calibri" w:hAnsi="Calibri"/>
+          <w:b/>
+          <w:color w:val="0F172A"/>
+          <w:sz w:val="25"/>
+        </w:rPr>
+        <w:t>Step 2: Citizens or Field Agents Report Signs of Danger</w:t>
+      </w:r>
+    </w:p>
+    <w:p>
+      <w:r>
+        <w:t>If a resident or driver spots a cracked road, a tilting tree, or loose boulders on a hillside, they open the Citizen Portal on their phone:</w:t>
       </w:r>
     </w:p>
     <w:p>
       <w:pPr>
         <w:pStyle w:val="ListBullet"/>
+        <w:spacing w:after="60"/>
       </w:pPr>
       <w:r>
-        <w:t>They select the incident type (Landslide, Slope Crack, Road Blockage, or Flooding) and severity (Minor, Moderate, Severe).</w:t>
+        <w:rPr>
+          <w:b/>
+          <w:color w:val="0F172A"/>
+        </w:rPr>
+        <w:t xml:space="preserve">Select Incident Type: </w:t>
+      </w:r>
+      <w:r>
+        <w:rPr>
+          <w:color w:val="334155"/>
+        </w:rPr>
+        <w:t>Choose Landslide, Slope Crack, Road Blockage, or Flooding.</w:t>
       </w:r>
     </w:p>
     <w:p>
       <w:pPr>
         <w:pStyle w:val="ListBullet"/>
+        <w:spacing w:after="60"/>
       </w:pPr>
       <w:r>
-        <w:t>The phone's GPS automatically captures the exact latitude and longitude.</w:t>
+        <w:rPr>
+          <w:b/>
+          <w:color w:val="0F172A"/>
+        </w:rPr>
+        <w:t xml:space="preserve">Select Severity: </w:t>
+      </w:r>
+      <w:r>
+        <w:rPr>
+          <w:color w:val="334155"/>
+        </w:rPr>
+        <w:t>Minor, Moderate, or Severe.</w:t>
       </w:r>
     </w:p>
     <w:p>
       <w:pPr>
         <w:pStyle w:val="ListBullet"/>
+        <w:spacing w:after="60"/>
       </w:pPr>
       <w:r>
-        <w:t>They attach a photo or video as evidence.</w:t>
+        <w:rPr>
+          <w:b/>
+          <w:color w:val="0F172A"/>
+        </w:rPr>
+        <w:t xml:space="preserve">Automatic GPS: </w:t>
+      </w:r>
+      <w:r>
+        <w:rPr>
+          <w:color w:val="334155"/>
+        </w:rPr>
+        <w:t>The phone automatically detects the exact latitude and longitude coordinates.</w:t>
       </w:r>
     </w:p>
     <w:p>
       <w:pPr>
         <w:pStyle w:val="ListBullet"/>
+        <w:spacing w:after="60"/>
       </w:pPr>
       <w:r>
-        <w:t>Clicking 'Submit' uploads the photo to cloud storage and saves the report as 'Pending'.</w:t>
+        <w:rPr>
+          <w:b/>
+          <w:color w:val="0F172A"/>
+        </w:rPr>
+        <w:t xml:space="preserve">Attach Evidence: </w:t>
+      </w:r>
+      <w:r>
+        <w:rPr>
+          <w:color w:val="334155"/>
+        </w:rPr>
+        <w:t>Upload a photo or short video of the crack or blockage.</w:t>
       </w:r>
     </w:p>
     <w:p>
       <w:pPr>
         <w:pStyle w:val="ListBullet"/>
+        <w:spacing w:after="60"/>
       </w:pPr>
       <w:r>
-        <w:t>A notification is sent automatically to the emergency control room.</w:t>
+        <w:rPr>
+          <w:b/>
+          <w:color w:val="0F172A"/>
+        </w:rPr>
+        <w:t xml:space="preserve">Submit: </w:t>
+      </w:r>
+      <w:r>
+        <w:rPr>
+          <w:color w:val="334155"/>
+        </w:rPr>
+        <w:t>The report is saved into cloud storage with the status 'Pending', and the emergency room is immediately alerted.</w:t>
+      </w:r>
+    </w:p>
+    <w:p>
+      <w:pPr>
+        <w:spacing w:before="240" w:after="80"/>
+      </w:pPr>
+      <w:r>
+        <w:rPr>
+          <w:rFonts w:ascii="Calibri" w:hAnsi="Calibri"/>
+          <w:b/>
+          <w:color w:val="0F172A"/>
+          <w:sz w:val="25"/>
+        </w:rPr>
+        <w:t>Step 3: Disaster Management Officers Verify the Report</w:t>
       </w:r>
     </w:p>
     <w:p>
       <w:r>
+        <w:t>Control room officers see the new report on their Admin Dashboard. They view the photo, the GPS pin on the map, and the description. If it is a real hazard, the officer clicks 'Verify'. If it was spam or duplicate, they click 'Reject'.</w:t>
+      </w:r>
+    </w:p>
+    <w:p>
+      <w:pPr>
+        <w:spacing w:before="240" w:after="80"/>
+      </w:pPr>
+      <w:r>
         <w:rPr>
+          <w:rFonts w:ascii="Calibri" w:hAnsi="Calibri"/>
           <w:b/>
-          <w:color w:val="2C3E50"/>
-          <w:sz w:val="24"/>
+          <w:color w:val="0F172A"/>
+          <w:sz w:val="25"/>
         </w:rPr>
-        <w:t>B. Officer Verification Workflow</w:t>
+        <w:t>Step 4: AI Model Calculates the Landslide Risk Level</w:t>
+      </w:r>
+    </w:p>
+    <w:p>
+      <w:r>
+        <w:t>Once verified, or whenever an officer tests a location, the AI system looks at 4 simple factors:</w:t>
       </w:r>
     </w:p>
     <w:p>
       <w:pPr>
         <w:pStyle w:val="ListBullet"/>
+        <w:spacing w:after="60"/>
       </w:pPr>
       <w:r>
-        <w:t>The disaster response officer opens the 'Reports' screen in the admin dashboard.</w:t>
+        <w:rPr>
+          <w:b/>
+          <w:color w:val="0F172A"/>
+        </w:rPr>
+        <w:t xml:space="preserve">1. 24-Hour Rainfall (35% importance): </w:t>
+      </w:r>
+      <w:r>
+        <w:rPr>
+          <w:color w:val="334155"/>
+        </w:rPr>
+        <w:t>How many millimeters of rain fell in the last 24 hours.</w:t>
       </w:r>
     </w:p>
     <w:p>
       <w:pPr>
         <w:pStyle w:val="ListBullet"/>
+        <w:spacing w:after="60"/>
       </w:pPr>
       <w:r>
-        <w:t>They review incoming reports waiting for evaluation.</w:t>
+        <w:rPr>
+          <w:b/>
+          <w:color w:val="0F172A"/>
+        </w:rPr>
+        <w:t xml:space="preserve">2. Soil Wetness (25% importance): </w:t>
+      </w:r>
+      <w:r>
+        <w:rPr>
+          <w:color w:val="334155"/>
+        </w:rPr>
+        <w:t>How saturated the ground is with water (pore-water pressure).</w:t>
       </w:r>
     </w:p>
     <w:p>
       <w:pPr>
         <w:pStyle w:val="ListBullet"/>
+        <w:spacing w:after="60"/>
       </w:pPr>
       <w:r>
-        <w:t>The officer checks the uploaded photo, location on the map, and description.</w:t>
+        <w:rPr>
+          <w:b/>
+          <w:color w:val="0F172A"/>
+        </w:rPr>
+        <w:t xml:space="preserve">3. Slope Steepness (25% importance): </w:t>
+      </w:r>
+      <w:r>
+        <w:rPr>
+          <w:color w:val="334155"/>
+        </w:rPr>
+        <w:t>How steep the mountain is in degrees (steeper than 35° is high danger).</w:t>
       </w:r>
     </w:p>
     <w:p>
       <w:pPr>
         <w:pStyle w:val="ListBullet"/>
+        <w:spacing w:after="60"/>
       </w:pPr>
       <w:r>
-        <w:t>If genuine, the officer clicks 'Verify' (or 'Reject' if duplicate or false).</w:t>
+        <w:rPr>
+          <w:b/>
+          <w:color w:val="0F172A"/>
+        </w:rPr>
+        <w:t xml:space="preserve">4. Historical Landslide Catalog (15% importance): </w:t>
+      </w:r>
+      <w:r>
+        <w:rPr>
+          <w:color w:val="334155"/>
+        </w:rPr>
+        <w:t>How many landslides happened at this hill in the past 10 years.</w:t>
+      </w:r>
+    </w:p>
+    <w:p>
+      <w:r>
+        <w:t>The AI gives a simple, color-coded result: Low (Green), Medium (Blue), High (Amber), or Critical (Red), along with easy explanations like 'Heavy rain exceeding safety threshold' or 'Steep slope near liquid limit'.</w:t>
+      </w:r>
+    </w:p>
+    <w:p>
+      <w:pPr>
+        <w:spacing w:before="240" w:after="80"/>
+      </w:pPr>
+      <w:r>
+        <w:rPr>
+          <w:rFonts w:ascii="Calibri" w:hAnsi="Calibri"/>
+          <w:b/>
+          <w:color w:val="0F172A"/>
+          <w:sz w:val="25"/>
+        </w:rPr>
+        <w:t>Step 5: Emergency Pop-Up Alert Box Warns the Public</w:t>
+      </w:r>
+    </w:p>
+    <w:p>
+      <w:r>
+        <w:t>When an incident is verified as Severe or the AI predicts Critical danger, the system triggers the Emergency Alert Box:</w:t>
       </w:r>
     </w:p>
     <w:p>
       <w:pPr>
         <w:pStyle w:val="ListBullet"/>
+        <w:spacing w:after="60"/>
       </w:pPr>
-      <w:r>
-        <w:t>Once verified, the database updates to 'Verified' and alerts are triggered.</w:t>
-      </w:r>
-    </w:p>
-    <w:p>
       <w:r>
         <w:rPr>
           <w:b/>
-          <w:color w:val="2C3E50"/>
-          <w:sz w:val="24"/>
+          <w:color w:val="0F172A"/>
         </w:rPr>
-        <w:t>C. AI Risk Prediction Workflow</w:t>
+        <w:t xml:space="preserve">Audible Siren: </w:t>
+      </w:r>
+      <w:r>
+        <w:rPr>
+          <w:color w:val="334155"/>
+        </w:rPr>
+        <w:t>Users can toggle an audible alarm to grab immediate attention.</w:t>
       </w:r>
     </w:p>
     <w:p>
       <w:pPr>
         <w:pStyle w:val="ListBullet"/>
+        <w:spacing w:after="60"/>
       </w:pPr>
       <w:r>
-        <w:t>The system evaluates 4 simple indicators for any mountain location:</w:t>
+        <w:rPr>
+          <w:b/>
+          <w:color w:val="0F172A"/>
+        </w:rPr>
+        <w:t xml:space="preserve">Clear Life-Safety Directives: </w:t>
+      </w:r>
+      <w:r>
+        <w:rPr>
+          <w:color w:val="334155"/>
+        </w:rPr>
+        <w:t>Explains exactly what to do (e.g., 'Evacuate within 200m buffer zone', 'Highway closed, divert via alternative route').</w:t>
       </w:r>
     </w:p>
     <w:p>
       <w:pPr>
         <w:pStyle w:val="ListBullet"/>
+        <w:spacing w:after="60"/>
       </w:pPr>
       <w:r>
-        <w:t xml:space="preserve">  * Rainfall (35% importance): How much rain fell in the last 24 hours.</w:t>
+        <w:rPr>
+          <w:b/>
+          <w:color w:val="0F172A"/>
+        </w:rPr>
+        <w:t xml:space="preserve">One-Tap Toll-Free Call: </w:t>
+      </w:r>
+      <w:r>
+        <w:rPr>
+          <w:color w:val="334155"/>
+        </w:rPr>
+        <w:t>A big red button to dial the State Disaster Helpline (1070 / 112) instantly.</w:t>
       </w:r>
     </w:p>
     <w:p>
       <w:pPr>
         <w:pStyle w:val="ListBullet"/>
+        <w:spacing w:after="60"/>
       </w:pPr>
       <w:r>
-        <w:t xml:space="preserve">  * Soil Wetness (25% importance): How saturated the ground is with water.</w:t>
+        <w:rPr>
+          <w:b/>
+          <w:color w:val="0F172A"/>
+        </w:rPr>
+        <w:t xml:space="preserve">Evacuation &amp; Map Links: </w:t>
+      </w:r>
+      <w:r>
+        <w:rPr>
+          <w:color w:val="334155"/>
+        </w:rPr>
+        <w:t>Direct links to view emergency shelter locations and see the danger pin on the live map.</w:t>
+      </w:r>
+    </w:p>
+    <w:p>
+      <w:pPr>
+        <w:spacing w:before="360" w:after="120"/>
+      </w:pPr>
+      <w:r>
+        <w:rPr>
+          <w:rFonts w:ascii="Calibri" w:hAnsi="Calibri"/>
+          <w:b/>
+          <w:color w:val="1E3A8A"/>
+          <w:sz w:val="30"/>
+        </w:rPr>
+        <w:t>3. Guide to All the Pages on the Website</w:t>
+      </w:r>
+    </w:p>
+    <w:p>
+      <w:r>
+        <w:t>The website is split into two sections: Public Pages (open to all citizens without logging in) and Staff Console (for officers and admins).</w:t>
+      </w:r>
+    </w:p>
+    <w:p>
+      <w:pPr>
+        <w:spacing w:before="240" w:after="80"/>
+      </w:pPr>
+      <w:r>
+        <w:rPr>
+          <w:rFonts w:ascii="Calibri" w:hAnsi="Calibri"/>
+          <w:b/>
+          <w:color w:val="0F172A"/>
+          <w:sz w:val="25"/>
+        </w:rPr>
+        <w:t>A. Public Pages (Accessible to Everyone)</w:t>
       </w:r>
     </w:p>
     <w:p>
       <w:pPr>
         <w:pStyle w:val="ListBullet"/>
+        <w:spacing w:after="60"/>
       </w:pPr>
       <w:r>
-        <w:t xml:space="preserve">  * Hill Slope (25% importance): How steep the mountain side is.</w:t>
+        <w:rPr>
+          <w:b/>
+          <w:color w:val="0F172A"/>
+        </w:rPr>
+        <w:t xml:space="preserve">1. Home Page (/): </w:t>
+      </w:r>
+      <w:r>
+        <w:rPr>
+          <w:color w:val="334155"/>
+        </w:rPr>
+        <w:t>Features an active emergency alert marquee, live status counters (87 stations active), an 8-state landslide risk index, an embedded interactive map, live weather telemetry, and an interactive AI risk calculator where anyone can test sliders and see live predictions.</w:t>
       </w:r>
     </w:p>
     <w:p>
       <w:pPr>
         <w:pStyle w:val="ListBullet"/>
+        <w:spacing w:after="60"/>
       </w:pPr>
       <w:r>
-        <w:t xml:space="preserve">  * Past History (15% importance): How many past landslides occurred there.</w:t>
+        <w:rPr>
+          <w:b/>
+          <w:color w:val="0F172A"/>
+        </w:rPr>
+        <w:t xml:space="preserve">2. Live GIS Risk Map (/map): </w:t>
+      </w:r>
+      <w:r>
+        <w:rPr>
+          <w:color w:val="334155"/>
+        </w:rPr>
+        <w:t>Full-screen interactive map showing all monitored landslide spots with color-coded risk circles (Critical, High, Medium, Low). Includes search by hill name, district filters, and detailed pop-up cards.</w:t>
       </w:r>
     </w:p>
     <w:p>
       <w:pPr>
         <w:pStyle w:val="ListBullet"/>
+        <w:spacing w:after="60"/>
       </w:pPr>
       <w:r>
-        <w:t>The model assigns a hazard level: Low, Medium, High, or Critical.</w:t>
+        <w:rPr>
+          <w:b/>
+          <w:color w:val="0F172A"/>
+        </w:rPr>
+        <w:t xml:space="preserve">3. Weather Radar (/weather): </w:t>
+      </w:r>
+      <w:r>
+        <w:rPr>
+          <w:color w:val="334155"/>
+        </w:rPr>
+        <w:t>Shows live 24-hour rain gauges for all 8 state capitals, soil saturation ratio (%), slope failure vulnerability score, and a 7-day rainfall forecast.</w:t>
       </w:r>
     </w:p>
     <w:p>
       <w:pPr>
         <w:pStyle w:val="ListBullet"/>
+        <w:spacing w:after="60"/>
       </w:pPr>
-      <w:r>
-        <w:t>It gives plain-language explanations (e.g., 'Heavy rainfall exceeding safety threshold').</w:t>
-      </w:r>
-    </w:p>
-    <w:p>
       <w:r>
         <w:rPr>
           <w:b/>
-          <w:color w:val="2C3E50"/>
-          <w:sz w:val="24"/>
+          <w:color w:val="0F172A"/>
         </w:rPr>
-        <w:t>D. Emergency Alert Workflow</w:t>
+        <w:t xml:space="preserve">4. Emergency Alerts Bulletin (/alerts): </w:t>
+      </w:r>
+      <w:r>
+        <w:rPr>
+          <w:color w:val="334155"/>
+        </w:rPr>
+        <w:t>A public noticeboard for official Red, Orange, and Yellow disaster advisories issued by state authorities, with direct 1-tap buttons to open the Warning Pop-Up Box.</w:t>
       </w:r>
     </w:p>
     <w:p>
       <w:pPr>
         <w:pStyle w:val="ListBullet"/>
+        <w:spacing w:after="60"/>
       </w:pPr>
       <w:r>
-        <w:t>When an incident is verified or risk is Critical, alerts are dispatched.</w:t>
+        <w:rPr>
+          <w:b/>
+          <w:color w:val="0F172A"/>
+        </w:rPr>
+        <w:t xml:space="preserve">5. Safety &amp; Evacuation Guide (/safety): </w:t>
+      </w:r>
+      <w:r>
+        <w:rPr>
+          <w:color w:val="334155"/>
+        </w:rPr>
+        <w:t>Teaches citizens 6 physical warning signs (like stuck doors, tilting trees, muddy spring water), gives a 3-step action guide (Before, During, After a slide), and includes an Interactive 72-Hour Emergency Go-Bag checklist with checkboxes.</w:t>
       </w:r>
     </w:p>
     <w:p>
       <w:pPr>
         <w:pStyle w:val="ListBullet"/>
+        <w:spacing w:after="60"/>
       </w:pPr>
       <w:r>
-        <w:t>SMS: Text messages sent directly to residents in the affected district.</w:t>
+        <w:rPr>
+          <w:b/>
+          <w:color w:val="0F172A"/>
+        </w:rPr>
+        <w:t xml:space="preserve">6. About the System (/about): </w:t>
+      </w:r>
+      <w:r>
+        <w:rPr>
+          <w:color w:val="334155"/>
+        </w:rPr>
+        <w:t>Explains the sensor network (piezometers, inclinometers, IMD radar, satellites) and lists official partner agencies (GSI, IMD, NDMA, NESAC, NEC).</w:t>
+      </w:r>
+    </w:p>
+    <w:p>
+      <w:pPr>
+        <w:spacing w:before="240" w:after="80"/>
+      </w:pPr>
+      <w:r>
+        <w:rPr>
+          <w:rFonts w:ascii="Calibri" w:hAnsi="Calibri"/>
+          <w:b/>
+          <w:color w:val="0F172A"/>
+          <w:sz w:val="25"/>
+        </w:rPr>
+        <w:t>B. Citizen Portal (For Community Volunteers &amp; Residents)</w:t>
       </w:r>
     </w:p>
     <w:p>
       <w:pPr>
         <w:pStyle w:val="ListBullet"/>
+        <w:spacing w:after="60"/>
       </w:pPr>
       <w:r>
-        <w:t>Web Push: Pop-up notifications sent to subscribed smartphones and browsers.</w:t>
+        <w:rPr>
+          <w:b/>
+          <w:color w:val="0F172A"/>
+        </w:rPr>
+        <w:t xml:space="preserve">Citizen Report (/citizen/report): </w:t>
+      </w:r>
+      <w:r>
+        <w:rPr>
+          <w:color w:val="334155"/>
+        </w:rPr>
+        <w:t>The form where citizens submit new photos, GPS coordinates, and severity of road blockages and slope cracks.</w:t>
       </w:r>
     </w:p>
     <w:p>
       <w:pPr>
         <w:pStyle w:val="ListBullet"/>
+        <w:spacing w:after="60"/>
       </w:pPr>
       <w:r>
-        <w:t>Email: Priority alerts sent to District Disaster Management Authorities.</w:t>
+        <w:rPr>
+          <w:b/>
+          <w:color w:val="0F172A"/>
+        </w:rPr>
+        <w:t xml:space="preserve">My Reports (/citizen/my-reports): </w:t>
+      </w:r>
+      <w:r>
+        <w:rPr>
+          <w:color w:val="334155"/>
+        </w:rPr>
+        <w:t>Allows citizens to track whether their submitted report has been reviewed or verified by officers.</w:t>
       </w:r>
     </w:p>
     <w:p>
       <w:pPr>
-        <w:spacing w:after="240"/>
+        <w:pStyle w:val="ListBullet"/>
+        <w:spacing w:after="60"/>
       </w:pPr>
+      <w:r>
+        <w:rPr>
+          <w:b/>
+          <w:color w:val="0F172A"/>
+        </w:rPr>
+        <w:t xml:space="preserve">Citizen Map (/citizen/map): </w:t>
+      </w:r>
+      <w:r>
+        <w:rPr>
+          <w:color w:val="334155"/>
+        </w:rPr>
+        <w:t>Local map view focused on the citizen's own home district.</w:t>
+      </w:r>
     </w:p>
     <w:p>
       <w:pPr>
-        <w:pStyle w:val="Heading1"/>
+        <w:spacing w:before="240" w:after="80"/>
       </w:pPr>
       <w:r>
         <w:rPr>
-          <w:color w:val="1B365D"/>
-          <w:sz w:val="32"/>
+          <w:rFonts w:ascii="Calibri" w:hAnsi="Calibri"/>
+          <w:b/>
+          <w:color w:val="0F172A"/>
+          <w:sz w:val="25"/>
         </w:rPr>
-        <w:t>3. Technology Stack (Tools Used)</w:t>
+        <w:t>C. Admin Console (For Disaster Management Officers)</w:t>
+      </w:r>
+    </w:p>
+    <w:p>
+      <w:pPr>
+        <w:pStyle w:val="ListBullet"/>
+        <w:spacing w:after="60"/>
+      </w:pPr>
+      <w:r>
+        <w:rPr>
+          <w:b/>
+          <w:color w:val="0F172A"/>
+        </w:rPr>
+        <w:t xml:space="preserve">Dashboard (/admin/dashboard): </w:t>
+      </w:r>
+      <w:r>
+        <w:rPr>
+          <w:color w:val="334155"/>
+        </w:rPr>
+        <w:t>Shows active alert counts, verified report metrics today, summary risk charts, and an operational embedded live map.</w:t>
+      </w:r>
+    </w:p>
+    <w:p>
+      <w:pPr>
+        <w:pStyle w:val="ListBullet"/>
+        <w:spacing w:after="60"/>
+      </w:pPr>
+      <w:r>
+        <w:rPr>
+          <w:b/>
+          <w:color w:val="0F172A"/>
+        </w:rPr>
+        <w:t xml:space="preserve">AI Model Console (/admin/ai-model): </w:t>
+      </w:r>
+      <w:r>
+        <w:rPr>
+          <w:color w:val="334155"/>
+        </w:rPr>
+        <w:t>Features a Live Inference Workbench where officers can pick any hill, change rain numbers, click 'Run Live Inference', and see exact risk level and confidence from the Python AI service.</w:t>
+      </w:r>
+    </w:p>
+    <w:p>
+      <w:pPr>
+        <w:pStyle w:val="ListBullet"/>
+        <w:spacing w:after="60"/>
+      </w:pPr>
+      <w:r>
+        <w:rPr>
+          <w:b/>
+          <w:color w:val="0F172A"/>
+        </w:rPr>
+        <w:t xml:space="preserve">Reports Verification (/admin/reports): </w:t>
+      </w:r>
+      <w:r>
+        <w:rPr>
+          <w:color w:val="334155"/>
+        </w:rPr>
+        <w:t>Review photos and descriptions submitted by the public and click 'Verify' or 'Reject'.</w:t>
+      </w:r>
+    </w:p>
+    <w:p>
+      <w:pPr>
+        <w:pStyle w:val="ListBullet"/>
+        <w:spacing w:after="60"/>
+      </w:pPr>
+      <w:r>
+        <w:rPr>
+          <w:b/>
+          <w:color w:val="0F172A"/>
+        </w:rPr>
+        <w:t xml:space="preserve">User Management (/admin/users): </w:t>
+      </w:r>
+      <w:r>
+        <w:rPr>
+          <w:color w:val="334155"/>
+        </w:rPr>
+        <w:t>Manage district officers and field agents.</w:t>
+      </w:r>
+    </w:p>
+    <w:p>
+      <w:pPr>
+        <w:spacing w:before="360" w:after="120"/>
+      </w:pPr>
+      <w:r>
+        <w:rPr>
+          <w:rFonts w:ascii="Calibri" w:hAnsi="Calibri"/>
+          <w:b/>
+          <w:color w:val="1E3A8A"/>
+          <w:sz w:val="30"/>
+        </w:rPr>
+        <w:t>4. Technology Stack (Tools Used in the Project)</w:t>
       </w:r>
     </w:p>
     <w:tbl>
@@ -811,7 +854,7 @@
         <w:tc>
           <w:tcPr>
             <w:tcW w:type="dxa" w:w="3312"/>
-            <w:shd w:fill="1B365D"/>
+            <w:shd w:val="clear" w:color="auto" w:fill="1E3A8A"/>
             <w:tcMar>
               <w:top w:w="120" w:type="dxa"/>
               <w:bottom w:w="120" w:type="dxa"/>
@@ -825,14 +868,14 @@
                 <w:b/>
                 <w:color w:val="FFFFFF"/>
               </w:rPr>
-              <w:t>Layer</w:t>
+              <w:t>Part</w:t>
             </w:r>
           </w:p>
         </w:tc>
         <w:tc>
           <w:tcPr>
             <w:tcW w:type="dxa" w:w="3312"/>
-            <w:shd w:fill="1B365D"/>
+            <w:shd w:val="clear" w:color="auto" w:fill="1E3A8A"/>
             <w:tcMar>
               <w:top w:w="120" w:type="dxa"/>
               <w:bottom w:w="120" w:type="dxa"/>
@@ -846,14 +889,14 @@
                 <w:b/>
                 <w:color w:val="FFFFFF"/>
               </w:rPr>
-              <w:t>Tool</w:t>
+              <w:t>Technology Used</w:t>
             </w:r>
           </w:p>
         </w:tc>
         <w:tc>
           <w:tcPr>
             <w:tcW w:type="dxa" w:w="3312"/>
-            <w:shd w:fill="1B365D"/>
+            <w:shd w:val="clear" w:color="auto" w:fill="1E3A8A"/>
             <w:tcMar>
               <w:top w:w="120" w:type="dxa"/>
               <w:bottom w:w="120" w:type="dxa"/>
@@ -867,7 +910,7 @@
                 <w:b/>
                 <w:color w:val="FFFFFF"/>
               </w:rPr>
-              <w:t>What It Does (Simple Description)</w:t>
+              <w:t>What it Does in Simple Terms</w:t>
             </w:r>
           </w:p>
         </w:tc>
@@ -876,29 +919,11 @@
         <w:tc>
           <w:tcPr>
             <w:tcW w:type="dxa" w:w="3312"/>
-            <w:shd w:fill="F4F6F7"/>
             <w:tcMar>
               <w:top w:w="100" w:type="dxa"/>
               <w:bottom w:w="100" w:type="dxa"/>
-              <w:left w:w="150" w:type="dxa"/>
-              <w:right w:w="150" w:type="dxa"/>
-            </w:tcMar>
-          </w:tcPr>
-          <w:p>
-            <w:r>
-              <w:t>Frontend (User UI)</w:t>
-            </w:r>
-          </w:p>
-        </w:tc>
-        <w:tc>
-          <w:tcPr>
-            <w:tcW w:type="dxa" w:w="3312"/>
-            <w:shd w:fill="EAEDED"/>
-            <w:tcMar>
-              <w:top w:w="100" w:type="dxa"/>
-              <w:bottom w:w="100" w:type="dxa"/>
-              <w:left w:w="150" w:type="dxa"/>
-              <w:right w:w="150" w:type="dxa"/>
+              <w:left w:w="140" w:type="dxa"/>
+              <w:right w:w="140" w:type="dxa"/>
             </w:tcMar>
           </w:tcPr>
           <w:p>
@@ -906,24 +931,39 @@
               <w:rPr>
                 <w:b/>
               </w:rPr>
-              <w:t>React</w:t>
+              <w:t>Frontend (Website)</w:t>
             </w:r>
           </w:p>
         </w:tc>
         <w:tc>
           <w:tcPr>
             <w:tcW w:type="dxa" w:w="3312"/>
-            <w:shd w:fill="FFFFFF"/>
             <w:tcMar>
               <w:top w:w="100" w:type="dxa"/>
               <w:bottom w:w="100" w:type="dxa"/>
-              <w:left w:w="150" w:type="dxa"/>
-              <w:right w:w="150" w:type="dxa"/>
+              <w:left w:w="140" w:type="dxa"/>
+              <w:right w:w="140" w:type="dxa"/>
             </w:tcMar>
           </w:tcPr>
           <w:p>
             <w:r>
-              <w:t>Builds the web pages, buttons, forms, and interactive screens.</w:t>
+              <w:t>React + Vite + Tailwind CSS</w:t>
+            </w:r>
+          </w:p>
+        </w:tc>
+        <w:tc>
+          <w:tcPr>
+            <w:tcW w:type="dxa" w:w="3312"/>
+            <w:tcMar>
+              <w:top w:w="100" w:type="dxa"/>
+              <w:bottom w:w="100" w:type="dxa"/>
+              <w:left w:w="140" w:type="dxa"/>
+              <w:right w:w="140" w:type="dxa"/>
+            </w:tcMar>
+          </w:tcPr>
+          <w:p>
+            <w:r>
+              <w:t>Builds the web pages, buttons, forms, and responsive screens that users see in their browser.</w:t>
             </w:r>
           </w:p>
         </w:tc>
@@ -932,54 +972,54 @@
         <w:tc>
           <w:tcPr>
             <w:tcW w:type="dxa" w:w="3312"/>
-            <w:shd w:fill="F4F6F7"/>
             <w:tcMar>
               <w:top w:w="100" w:type="dxa"/>
               <w:bottom w:w="100" w:type="dxa"/>
-              <w:left w:w="150" w:type="dxa"/>
-              <w:right w:w="150" w:type="dxa"/>
+              <w:left w:w="140" w:type="dxa"/>
+              <w:right w:w="140" w:type="dxa"/>
             </w:tcMar>
+            <w:shd w:val="clear" w:color="auto" w:fill="F8FAFC"/>
           </w:tcPr>
           <w:p>
             <w:r>
-              <w:t>Frontend (User UI)</w:t>
+              <w:rPr>
+                <w:b/>
+              </w:rPr>
+              <w:t>Interactive Maps</w:t>
             </w:r>
           </w:p>
         </w:tc>
         <w:tc>
           <w:tcPr>
             <w:tcW w:type="dxa" w:w="3312"/>
-            <w:shd w:fill="EAEDED"/>
             <w:tcMar>
               <w:top w:w="100" w:type="dxa"/>
               <w:bottom w:w="100" w:type="dxa"/>
-              <w:left w:w="150" w:type="dxa"/>
-              <w:right w:w="150" w:type="dxa"/>
+              <w:left w:w="140" w:type="dxa"/>
+              <w:right w:w="140" w:type="dxa"/>
             </w:tcMar>
+            <w:shd w:val="clear" w:color="auto" w:fill="F8FAFC"/>
           </w:tcPr>
           <w:p>
             <w:r>
-              <w:rPr>
-                <w:b/>
-              </w:rPr>
-              <w:t>Tailwind CSS</w:t>
+              <w:t>Leaflet + OpenStreetMap</w:t>
             </w:r>
           </w:p>
         </w:tc>
         <w:tc>
           <w:tcPr>
             <w:tcW w:type="dxa" w:w="3312"/>
-            <w:shd w:fill="FFFFFF"/>
             <w:tcMar>
               <w:top w:w="100" w:type="dxa"/>
               <w:bottom w:w="100" w:type="dxa"/>
-              <w:left w:w="150" w:type="dxa"/>
-              <w:right w:w="150" w:type="dxa"/>
+              <w:left w:w="140" w:type="dxa"/>
+              <w:right w:w="140" w:type="dxa"/>
             </w:tcMar>
+            <w:shd w:val="clear" w:color="auto" w:fill="F8FAFC"/>
           </w:tcPr>
           <w:p>
             <w:r>
-              <w:t>Styles the website to make it look clean, modern, and mobile-friendly.</w:t>
+              <w:t>Displays the live satellite and street maps with clickable landslide markers and color pins.</w:t>
             </w:r>
           </w:p>
         </w:tc>
@@ -988,29 +1028,11 @@
         <w:tc>
           <w:tcPr>
             <w:tcW w:type="dxa" w:w="3312"/>
-            <w:shd w:fill="F4F6F7"/>
             <w:tcMar>
               <w:top w:w="100" w:type="dxa"/>
               <w:bottom w:w="100" w:type="dxa"/>
-              <w:left w:w="150" w:type="dxa"/>
-              <w:right w:w="150" w:type="dxa"/>
-            </w:tcMar>
-          </w:tcPr>
-          <w:p>
-            <w:r>
-              <w:t>Frontend (User UI)</w:t>
-            </w:r>
-          </w:p>
-        </w:tc>
-        <w:tc>
-          <w:tcPr>
-            <w:tcW w:type="dxa" w:w="3312"/>
-            <w:shd w:fill="EAEDED"/>
-            <w:tcMar>
-              <w:top w:w="100" w:type="dxa"/>
-              <w:bottom w:w="100" w:type="dxa"/>
-              <w:left w:w="150" w:type="dxa"/>
-              <w:right w:w="150" w:type="dxa"/>
+              <w:left w:w="140" w:type="dxa"/>
+              <w:right w:w="140" w:type="dxa"/>
             </w:tcMar>
           </w:tcPr>
           <w:p>
@@ -1018,24 +1040,39 @@
               <w:rPr>
                 <w:b/>
               </w:rPr>
-              <w:t>Leaflet Maps</w:t>
+              <w:t>Backend (Server)</w:t>
             </w:r>
           </w:p>
         </w:tc>
         <w:tc>
           <w:tcPr>
             <w:tcW w:type="dxa" w:w="3312"/>
-            <w:shd w:fill="FFFFFF"/>
             <w:tcMar>
               <w:top w:w="100" w:type="dxa"/>
               <w:bottom w:w="100" w:type="dxa"/>
-              <w:left w:w="150" w:type="dxa"/>
-              <w:right w:w="150" w:type="dxa"/>
+              <w:left w:w="140" w:type="dxa"/>
+              <w:right w:w="140" w:type="dxa"/>
             </w:tcMar>
           </w:tcPr>
           <w:p>
             <w:r>
-              <w:t>Displays interactive maps showing landslide locations, danger pins, and GPS points.</w:t>
+              <w:t>Node.js + Express</w:t>
+            </w:r>
+          </w:p>
+        </w:tc>
+        <w:tc>
+          <w:tcPr>
+            <w:tcW w:type="dxa" w:w="3312"/>
+            <w:tcMar>
+              <w:top w:w="100" w:type="dxa"/>
+              <w:bottom w:w="100" w:type="dxa"/>
+              <w:left w:w="140" w:type="dxa"/>
+              <w:right w:w="140" w:type="dxa"/>
+            </w:tcMar>
+          </w:tcPr>
+          <w:p>
+            <w:r>
+              <w:t>The main coordinator that handles web requests, sends SMS/push alerts, and connects frontend to database.</w:t>
             </w:r>
           </w:p>
         </w:tc>
@@ -1044,54 +1081,54 @@
         <w:tc>
           <w:tcPr>
             <w:tcW w:type="dxa" w:w="3312"/>
-            <w:shd w:fill="F4F6F7"/>
             <w:tcMar>
               <w:top w:w="100" w:type="dxa"/>
               <w:bottom w:w="100" w:type="dxa"/>
-              <w:left w:w="150" w:type="dxa"/>
-              <w:right w:w="150" w:type="dxa"/>
+              <w:left w:w="140" w:type="dxa"/>
+              <w:right w:w="140" w:type="dxa"/>
             </w:tcMar>
+            <w:shd w:val="clear" w:color="auto" w:fill="F8FAFC"/>
           </w:tcPr>
           <w:p>
             <w:r>
-              <w:t>Frontend (User UI)</w:t>
+              <w:rPr>
+                <w:b/>
+              </w:rPr>
+              <w:t>AI / Machine Learning</w:t>
             </w:r>
           </w:p>
         </w:tc>
         <w:tc>
           <w:tcPr>
             <w:tcW w:type="dxa" w:w="3312"/>
-            <w:shd w:fill="EAEDED"/>
             <w:tcMar>
               <w:top w:w="100" w:type="dxa"/>
               <w:bottom w:w="100" w:type="dxa"/>
-              <w:left w:w="150" w:type="dxa"/>
-              <w:right w:w="150" w:type="dxa"/>
+              <w:left w:w="140" w:type="dxa"/>
+              <w:right w:w="140" w:type="dxa"/>
             </w:tcMar>
+            <w:shd w:val="clear" w:color="auto" w:fill="F8FAFC"/>
           </w:tcPr>
           <w:p>
             <w:r>
-              <w:rPr>
-                <w:b/>
-              </w:rPr>
-              <w:t>Chart.js</w:t>
+              <w:t>Python + FastAPI</w:t>
             </w:r>
           </w:p>
         </w:tc>
         <w:tc>
           <w:tcPr>
             <w:tcW w:type="dxa" w:w="3312"/>
-            <w:shd w:fill="FFFFFF"/>
             <w:tcMar>
               <w:top w:w="100" w:type="dxa"/>
               <w:bottom w:w="100" w:type="dxa"/>
-              <w:left w:w="150" w:type="dxa"/>
-              <w:right w:w="150" w:type="dxa"/>
+              <w:left w:w="140" w:type="dxa"/>
+              <w:right w:w="140" w:type="dxa"/>
             </w:tcMar>
+            <w:shd w:val="clear" w:color="auto" w:fill="F8FAFC"/>
           </w:tcPr>
           <w:p>
             <w:r>
-              <w:t>Draws simple graphs and charts showing risk trends and incident statistics.</w:t>
+              <w:t>The calculation engine that takes rainfall, terrain slope, and soil wetness to compute risk levels.</w:t>
             </w:r>
           </w:p>
         </w:tc>
@@ -1100,29 +1137,11 @@
         <w:tc>
           <w:tcPr>
             <w:tcW w:type="dxa" w:w="3312"/>
-            <w:shd w:fill="F4F6F7"/>
             <w:tcMar>
               <w:top w:w="100" w:type="dxa"/>
               <w:bottom w:w="100" w:type="dxa"/>
-              <w:left w:w="150" w:type="dxa"/>
-              <w:right w:w="150" w:type="dxa"/>
-            </w:tcMar>
-          </w:tcPr>
-          <w:p>
-            <w:r>
-              <w:t>Backend (Server)</w:t>
-            </w:r>
-          </w:p>
-        </w:tc>
-        <w:tc>
-          <w:tcPr>
-            <w:tcW w:type="dxa" w:w="3312"/>
-            <w:shd w:fill="EAEDED"/>
-            <w:tcMar>
-              <w:top w:w="100" w:type="dxa"/>
-              <w:bottom w:w="100" w:type="dxa"/>
-              <w:left w:w="150" w:type="dxa"/>
-              <w:right w:w="150" w:type="dxa"/>
+              <w:left w:w="140" w:type="dxa"/>
+              <w:right w:w="140" w:type="dxa"/>
             </w:tcMar>
           </w:tcPr>
           <w:p>
@@ -1130,98 +1149,6 @@
               <w:rPr>
                 <w:b/>
               </w:rPr>
-              <w:t>Node.js &amp; Express</w:t>
-            </w:r>
-          </w:p>
-        </w:tc>
-        <w:tc>
-          <w:tcPr>
-            <w:tcW w:type="dxa" w:w="3312"/>
-            <w:shd w:fill="FFFFFF"/>
-            <w:tcMar>
-              <w:top w:w="100" w:type="dxa"/>
-              <w:bottom w:w="100" w:type="dxa"/>
-              <w:left w:w="150" w:type="dxa"/>
-              <w:right w:w="150" w:type="dxa"/>
-            </w:tcMar>
-          </w:tcPr>
-          <w:p>
-            <w:r>
-              <w:t>Main engine connecting the website to database, handling requests, and sending alerts.</w:t>
-            </w:r>
-          </w:p>
-        </w:tc>
-      </w:tr>
-      <w:tr>
-        <w:tc>
-          <w:tcPr>
-            <w:tcW w:type="dxa" w:w="3312"/>
-            <w:shd w:fill="F4F6F7"/>
-            <w:tcMar>
-              <w:top w:w="100" w:type="dxa"/>
-              <w:bottom w:w="100" w:type="dxa"/>
-              <w:left w:w="150" w:type="dxa"/>
-              <w:right w:w="150" w:type="dxa"/>
-            </w:tcMar>
-          </w:tcPr>
-          <w:p>
-            <w:r>
-              <w:t>AI / Machine Learning</w:t>
-            </w:r>
-          </w:p>
-        </w:tc>
-        <w:tc>
-          <w:tcPr>
-            <w:tcW w:type="dxa" w:w="3312"/>
-            <w:shd w:fill="EAEDED"/>
-            <w:tcMar>
-              <w:top w:w="100" w:type="dxa"/>
-              <w:bottom w:w="100" w:type="dxa"/>
-              <w:left w:w="150" w:type="dxa"/>
-              <w:right w:w="150" w:type="dxa"/>
-            </w:tcMar>
-          </w:tcPr>
-          <w:p>
-            <w:r>
-              <w:rPr>
-                <w:b/>
-              </w:rPr>
-              <w:t>Python &amp; FastAPI</w:t>
-            </w:r>
-          </w:p>
-        </w:tc>
-        <w:tc>
-          <w:tcPr>
-            <w:tcW w:type="dxa" w:w="3312"/>
-            <w:shd w:fill="FFFFFF"/>
-            <w:tcMar>
-              <w:top w:w="100" w:type="dxa"/>
-              <w:bottom w:w="100" w:type="dxa"/>
-              <w:left w:w="150" w:type="dxa"/>
-              <w:right w:w="150" w:type="dxa"/>
-            </w:tcMar>
-          </w:tcPr>
-          <w:p>
-            <w:r>
-              <w:t>Intelligent risk scoring service calculating landslide danger from weather and terrain.</w:t>
-            </w:r>
-          </w:p>
-        </w:tc>
-      </w:tr>
-      <w:tr>
-        <w:tc>
-          <w:tcPr>
-            <w:tcW w:type="dxa" w:w="3312"/>
-            <w:shd w:fill="F4F6F7"/>
-            <w:tcMar>
-              <w:top w:w="100" w:type="dxa"/>
-              <w:bottom w:w="100" w:type="dxa"/>
-              <w:left w:w="150" w:type="dxa"/>
-              <w:right w:w="150" w:type="dxa"/>
-            </w:tcMar>
-          </w:tcPr>
-          <w:p>
-            <w:r>
               <w:t>Database &amp; Storage</w:t>
             </w:r>
           </w:p>
@@ -1229,19 +1156,15 @@
         <w:tc>
           <w:tcPr>
             <w:tcW w:type="dxa" w:w="3312"/>
-            <w:shd w:fill="EAEDED"/>
             <w:tcMar>
               <w:top w:w="100" w:type="dxa"/>
               <w:bottom w:w="100" w:type="dxa"/>
-              <w:left w:w="150" w:type="dxa"/>
-              <w:right w:w="150" w:type="dxa"/>
+              <w:left w:w="140" w:type="dxa"/>
+              <w:right w:w="140" w:type="dxa"/>
             </w:tcMar>
           </w:tcPr>
           <w:p>
             <w:r>
-              <w:rPr>
-                <w:b/>
-              </w:rPr>
               <w:t>Supabase (PostgreSQL)</w:t>
             </w:r>
           </w:p>
@@ -1249,73 +1172,16 @@
         <w:tc>
           <w:tcPr>
             <w:tcW w:type="dxa" w:w="3312"/>
-            <w:shd w:fill="FFFFFF"/>
             <w:tcMar>
               <w:top w:w="100" w:type="dxa"/>
               <w:bottom w:w="100" w:type="dxa"/>
-              <w:left w:w="150" w:type="dxa"/>
-              <w:right w:w="150" w:type="dxa"/>
+              <w:left w:w="140" w:type="dxa"/>
+              <w:right w:w="140" w:type="dxa"/>
             </w:tcMar>
           </w:tcPr>
           <w:p>
             <w:r>
-              <w:t>Safely stores all user accounts, landslide locations, and citizen reports.</w:t>
-            </w:r>
-          </w:p>
-        </w:tc>
-      </w:tr>
-      <w:tr>
-        <w:tc>
-          <w:tcPr>
-            <w:tcW w:type="dxa" w:w="3312"/>
-            <w:shd w:fill="F4F6F7"/>
-            <w:tcMar>
-              <w:top w:w="100" w:type="dxa"/>
-              <w:bottom w:w="100" w:type="dxa"/>
-              <w:left w:w="150" w:type="dxa"/>
-              <w:right w:w="150" w:type="dxa"/>
-            </w:tcMar>
-          </w:tcPr>
-          <w:p>
-            <w:r>
-              <w:t>Database &amp; Storage</w:t>
-            </w:r>
-          </w:p>
-        </w:tc>
-        <w:tc>
-          <w:tcPr>
-            <w:tcW w:type="dxa" w:w="3312"/>
-            <w:shd w:fill="EAEDED"/>
-            <w:tcMar>
-              <w:top w:w="100" w:type="dxa"/>
-              <w:bottom w:w="100" w:type="dxa"/>
-              <w:left w:w="150" w:type="dxa"/>
-              <w:right w:w="150" w:type="dxa"/>
-            </w:tcMar>
-          </w:tcPr>
-          <w:p>
-            <w:r>
-              <w:rPr>
-                <w:b/>
-              </w:rPr>
-              <w:t>Supabase Storage</w:t>
-            </w:r>
-          </w:p>
-        </w:tc>
-        <w:tc>
-          <w:tcPr>
-            <w:tcW w:type="dxa" w:w="3312"/>
-            <w:shd w:fill="FFFFFF"/>
-            <w:tcMar>
-              <w:top w:w="100" w:type="dxa"/>
-              <w:bottom w:w="100" w:type="dxa"/>
-              <w:left w:w="150" w:type="dxa"/>
-              <w:right w:w="150" w:type="dxa"/>
-            </w:tcMar>
-          </w:tcPr>
-          <w:p>
-            <w:r>
-              <w:t>Cloud folder that holds all uploaded photos and videos of landslide incidents.</w:t>
+              <w:t>Stores user logins, landslide locations, citizen reports, and holds uploaded photos in a cloud bucket.</w:t>
             </w:r>
           </w:p>
         </w:tc>
@@ -1328,128 +1194,624 @@
     </w:p>
     <w:p>
       <w:pPr>
-        <w:pStyle w:val="Heading1"/>
+        <w:spacing w:before="360" w:after="120"/>
       </w:pPr>
       <w:r>
         <w:rPr>
-          <w:color w:val="1B365D"/>
-          <w:sz w:val="32"/>
+          <w:rFonts w:ascii="Calibri" w:hAnsi="Calibri"/>
+          <w:b/>
+          <w:color w:val="1E3A8A"/>
+          <w:sz w:val="30"/>
         </w:rPr>
-        <w:t>4. Project Folders (Where Everything Lives)</w:t>
+        <w:t>5. API Reference (How the Services Talk to Each Other)</w:t>
       </w:r>
     </w:p>
     <w:p>
       <w:r>
-        <w:rPr>
-          <w:b/>
-          <w:color w:val="1B365D"/>
-        </w:rPr>
-        <w:t xml:space="preserve">frontend/ - </w:t>
-      </w:r>
-      <w:r>
-        <w:t>The website that users and officers see in their browser.</w:t>
+        <w:t>All services connect through clear, standardized web links (APIs):</w:t>
       </w:r>
     </w:p>
-    <w:p>
-      <w:pPr>
-        <w:pStyle w:val="ListBullet"/>
-      </w:pPr>
-      <w:r>
-        <w:t>src/pages/: Contains all screens (Home, Login, Citizen reporting, Admin dashboard).</w:t>
-      </w:r>
-    </w:p>
-    <w:p>
-      <w:pPr>
-        <w:pStyle w:val="ListBullet"/>
-      </w:pPr>
-      <w:r>
-        <w:t>src/components/: Reusable parts like maps, charts, and buttons.</w:t>
-      </w:r>
-    </w:p>
-    <w:p>
-      <w:pPr>
-        <w:pStyle w:val="ListBullet"/>
-      </w:pPr>
-      <w:r>
-        <w:t>src/services/: Functions that send and fetch data from the backend and database.</w:t>
-      </w:r>
-    </w:p>
-    <w:p>
-      <w:r>
-        <w:rPr>
-          <w:b/>
-          <w:color w:val="1B365D"/>
-        </w:rPr>
-        <w:t xml:space="preserve">backend/ - </w:t>
-      </w:r>
-      <w:r>
-        <w:t>The Node.js server that runs in the background.</w:t>
-      </w:r>
-    </w:p>
-    <w:p>
-      <w:pPr>
-        <w:pStyle w:val="ListBullet"/>
-      </w:pPr>
-      <w:r>
-        <w:t>src/routes/: Defines the web links (APIs) for reports, weather, and alerts.</w:t>
-      </w:r>
-    </w:p>
-    <w:p>
-      <w:pPr>
-        <w:pStyle w:val="ListBullet"/>
-      </w:pPr>
-      <w:r>
-        <w:t>src/controllers/: Logic for what happens when an API is called.</w:t>
-      </w:r>
-    </w:p>
-    <w:p>
-      <w:pPr>
-        <w:pStyle w:val="ListBullet"/>
-      </w:pPr>
-      <w:r>
-        <w:t>src/providers/: Services that fetch weather data, send SMS, and dispatch push alerts.</w:t>
-      </w:r>
-    </w:p>
-    <w:p>
-      <w:r>
-        <w:rPr>
-          <w:b/>
-          <w:color w:val="1B365D"/>
-        </w:rPr>
-        <w:t xml:space="preserve">ml-services/ - </w:t>
-      </w:r>
-      <w:r>
-        <w:t>The Python AI risk prediction engine.</w:t>
-      </w:r>
-    </w:p>
-    <w:p>
-      <w:pPr>
-        <w:pStyle w:val="ListBullet"/>
-      </w:pPr>
-      <w:r>
-        <w:t>app/services/risk_scoring.py: Formula that calculates risk (Low, Medium, High, Critical).</w:t>
-      </w:r>
-    </w:p>
-    <w:p>
-      <w:pPr>
-        <w:pStyle w:val="ListBullet"/>
-      </w:pPr>
-      <w:r>
-        <w:t>app/routers/predict.py: API that receives location and weather data and returns predictions.</w:t>
-      </w:r>
-    </w:p>
-    <w:p>
-      <w:r>
-        <w:rPr>
-          <w:b/>
-          <w:color w:val="1B365D"/>
-        </w:rPr>
-        <w:t xml:space="preserve">supabase_schema.sql - </w:t>
-      </w:r>
-      <w:r>
-        <w:t>The database setup file containing the tables, security rules, and sample data.</w:t>
-      </w:r>
-    </w:p>
+    <w:tbl>
+      <w:tblPr>
+        <w:tblW w:type="auto" w:w="0"/>
+        <w:jc w:val="center"/>
+        <w:tblLook w:firstColumn="1" w:firstRow="1" w:lastColumn="0" w:lastRow="0" w:noHBand="0" w:noVBand="1" w:val="04A0"/>
+      </w:tblPr>
+      <w:tblGrid>
+        <w:gridCol w:w="2484"/>
+        <w:gridCol w:w="2484"/>
+        <w:gridCol w:w="2484"/>
+        <w:gridCol w:w="2484"/>
+      </w:tblGrid>
+      <w:tr>
+        <w:tc>
+          <w:tcPr>
+            <w:tcW w:type="dxa" w:w="2484"/>
+            <w:shd w:val="clear" w:color="auto" w:fill="0F172A"/>
+            <w:tcMar>
+              <w:top w:w="120" w:type="dxa"/>
+              <w:bottom w:w="120" w:type="dxa"/>
+              <w:left w:w="140" w:type="dxa"/>
+              <w:right w:w="140" w:type="dxa"/>
+            </w:tcMar>
+          </w:tcPr>
+          <w:p>
+            <w:r>
+              <w:rPr>
+                <w:b/>
+                <w:color w:val="FFFFFF"/>
+              </w:rPr>
+              <w:t>Method</w:t>
+            </w:r>
+          </w:p>
+        </w:tc>
+        <w:tc>
+          <w:tcPr>
+            <w:tcW w:type="dxa" w:w="2484"/>
+            <w:shd w:val="clear" w:color="auto" w:fill="0F172A"/>
+            <w:tcMar>
+              <w:top w:w="120" w:type="dxa"/>
+              <w:bottom w:w="120" w:type="dxa"/>
+              <w:left w:w="140" w:type="dxa"/>
+              <w:right w:w="140" w:type="dxa"/>
+            </w:tcMar>
+          </w:tcPr>
+          <w:p>
+            <w:r>
+              <w:rPr>
+                <w:b/>
+                <w:color w:val="FFFFFF"/>
+              </w:rPr>
+              <w:t>Link (Endpoint)</w:t>
+            </w:r>
+          </w:p>
+        </w:tc>
+        <w:tc>
+          <w:tcPr>
+            <w:tcW w:type="dxa" w:w="2484"/>
+            <w:shd w:val="clear" w:color="auto" w:fill="0F172A"/>
+            <w:tcMar>
+              <w:top w:w="120" w:type="dxa"/>
+              <w:bottom w:w="120" w:type="dxa"/>
+              <w:left w:w="140" w:type="dxa"/>
+              <w:right w:w="140" w:type="dxa"/>
+            </w:tcMar>
+          </w:tcPr>
+          <w:p>
+            <w:r>
+              <w:rPr>
+                <w:b/>
+                <w:color w:val="FFFFFF"/>
+              </w:rPr>
+              <w:t>Who Uses It</w:t>
+            </w:r>
+          </w:p>
+        </w:tc>
+        <w:tc>
+          <w:tcPr>
+            <w:tcW w:type="dxa" w:w="2484"/>
+            <w:shd w:val="clear" w:color="auto" w:fill="0F172A"/>
+            <w:tcMar>
+              <w:top w:w="120" w:type="dxa"/>
+              <w:bottom w:w="120" w:type="dxa"/>
+              <w:left w:w="140" w:type="dxa"/>
+              <w:right w:w="140" w:type="dxa"/>
+            </w:tcMar>
+          </w:tcPr>
+          <w:p>
+            <w:r>
+              <w:rPr>
+                <w:b/>
+                <w:color w:val="FFFFFF"/>
+              </w:rPr>
+              <w:t>What it Does</w:t>
+            </w:r>
+          </w:p>
+        </w:tc>
+      </w:tr>
+      <w:tr>
+        <w:tc>
+          <w:tcPr>
+            <w:tcW w:type="dxa" w:w="2484"/>
+            <w:tcMar>
+              <w:top w:w="90" w:type="dxa"/>
+              <w:bottom w:w="90" w:type="dxa"/>
+              <w:left w:w="120" w:type="dxa"/>
+              <w:right w:w="120" w:type="dxa"/>
+            </w:tcMar>
+          </w:tcPr>
+          <w:p>
+            <w:r>
+              <w:rPr>
+                <w:b/>
+                <w:color w:val="2563EB"/>
+              </w:rPr>
+              <w:t>GET</w:t>
+            </w:r>
+          </w:p>
+        </w:tc>
+        <w:tc>
+          <w:tcPr>
+            <w:tcW w:type="dxa" w:w="2484"/>
+            <w:tcMar>
+              <w:top w:w="90" w:type="dxa"/>
+              <w:bottom w:w="90" w:type="dxa"/>
+              <w:left w:w="120" w:type="dxa"/>
+              <w:right w:w="120" w:type="dxa"/>
+            </w:tcMar>
+          </w:tcPr>
+          <w:p>
+            <w:r>
+              <w:t>/api/health</w:t>
+            </w:r>
+          </w:p>
+        </w:tc>
+        <w:tc>
+          <w:tcPr>
+            <w:tcW w:type="dxa" w:w="2484"/>
+            <w:tcMar>
+              <w:top w:w="90" w:type="dxa"/>
+              <w:bottom w:w="90" w:type="dxa"/>
+              <w:left w:w="120" w:type="dxa"/>
+              <w:right w:w="120" w:type="dxa"/>
+            </w:tcMar>
+          </w:tcPr>
+          <w:p>
+            <w:r>
+              <w:t>System</w:t>
+            </w:r>
+          </w:p>
+        </w:tc>
+        <w:tc>
+          <w:tcPr>
+            <w:tcW w:type="dxa" w:w="2484"/>
+            <w:tcMar>
+              <w:top w:w="90" w:type="dxa"/>
+              <w:bottom w:w="90" w:type="dxa"/>
+              <w:left w:w="120" w:type="dxa"/>
+              <w:right w:w="120" w:type="dxa"/>
+            </w:tcMar>
+          </w:tcPr>
+          <w:p>
+            <w:r>
+              <w:t>Checks if the backend server is running healthy.</w:t>
+            </w:r>
+          </w:p>
+        </w:tc>
+      </w:tr>
+      <w:tr>
+        <w:tc>
+          <w:tcPr>
+            <w:tcW w:type="dxa" w:w="2484"/>
+            <w:tcMar>
+              <w:top w:w="90" w:type="dxa"/>
+              <w:bottom w:w="90" w:type="dxa"/>
+              <w:left w:w="120" w:type="dxa"/>
+              <w:right w:w="120" w:type="dxa"/>
+            </w:tcMar>
+            <w:shd w:val="clear" w:color="auto" w:fill="F1F5F9"/>
+          </w:tcPr>
+          <w:p>
+            <w:r>
+              <w:rPr>
+                <w:b/>
+                <w:color w:val="2563EB"/>
+              </w:rPr>
+              <w:t>GET</w:t>
+            </w:r>
+          </w:p>
+        </w:tc>
+        <w:tc>
+          <w:tcPr>
+            <w:tcW w:type="dxa" w:w="2484"/>
+            <w:tcMar>
+              <w:top w:w="90" w:type="dxa"/>
+              <w:bottom w:w="90" w:type="dxa"/>
+              <w:left w:w="120" w:type="dxa"/>
+              <w:right w:w="120" w:type="dxa"/>
+            </w:tcMar>
+            <w:shd w:val="clear" w:color="auto" w:fill="F1F5F9"/>
+          </w:tcPr>
+          <w:p>
+            <w:r>
+              <w:t>/api/weather/:district</w:t>
+            </w:r>
+          </w:p>
+        </w:tc>
+        <w:tc>
+          <w:tcPr>
+            <w:tcW w:type="dxa" w:w="2484"/>
+            <w:tcMar>
+              <w:top w:w="90" w:type="dxa"/>
+              <w:bottom w:w="90" w:type="dxa"/>
+              <w:left w:w="120" w:type="dxa"/>
+              <w:right w:w="120" w:type="dxa"/>
+            </w:tcMar>
+            <w:shd w:val="clear" w:color="auto" w:fill="F1F5F9"/>
+          </w:tcPr>
+          <w:p>
+            <w:r>
+              <w:t>Frontend</w:t>
+            </w:r>
+          </w:p>
+        </w:tc>
+        <w:tc>
+          <w:tcPr>
+            <w:tcW w:type="dxa" w:w="2484"/>
+            <w:tcMar>
+              <w:top w:w="90" w:type="dxa"/>
+              <w:bottom w:w="90" w:type="dxa"/>
+              <w:left w:w="120" w:type="dxa"/>
+              <w:right w:w="120" w:type="dxa"/>
+            </w:tcMar>
+            <w:shd w:val="clear" w:color="auto" w:fill="F1F5F9"/>
+          </w:tcPr>
+          <w:p>
+            <w:r>
+              <w:t>Fetches live rainfall (mm) and 7-day weather forecast for any district.</w:t>
+            </w:r>
+          </w:p>
+        </w:tc>
+      </w:tr>
+      <w:tr>
+        <w:tc>
+          <w:tcPr>
+            <w:tcW w:type="dxa" w:w="2484"/>
+            <w:tcMar>
+              <w:top w:w="90" w:type="dxa"/>
+              <w:bottom w:w="90" w:type="dxa"/>
+              <w:left w:w="120" w:type="dxa"/>
+              <w:right w:w="120" w:type="dxa"/>
+            </w:tcMar>
+          </w:tcPr>
+          <w:p>
+            <w:r>
+              <w:rPr>
+                <w:b/>
+                <w:color w:val="16A34A"/>
+              </w:rPr>
+              <w:t>POST</w:t>
+            </w:r>
+          </w:p>
+        </w:tc>
+        <w:tc>
+          <w:tcPr>
+            <w:tcW w:type="dxa" w:w="2484"/>
+            <w:tcMar>
+              <w:top w:w="90" w:type="dxa"/>
+              <w:bottom w:w="90" w:type="dxa"/>
+              <w:left w:w="120" w:type="dxa"/>
+              <w:right w:w="120" w:type="dxa"/>
+            </w:tcMar>
+          </w:tcPr>
+          <w:p>
+            <w:r>
+              <w:t>/api/predict</w:t>
+            </w:r>
+          </w:p>
+        </w:tc>
+        <w:tc>
+          <w:tcPr>
+            <w:tcW w:type="dxa" w:w="2484"/>
+            <w:tcMar>
+              <w:top w:w="90" w:type="dxa"/>
+              <w:bottom w:w="90" w:type="dxa"/>
+              <w:left w:w="120" w:type="dxa"/>
+              <w:right w:w="120" w:type="dxa"/>
+            </w:tcMar>
+          </w:tcPr>
+          <w:p>
+            <w:r>
+              <w:t>Public &amp; AI Sandbox</w:t>
+            </w:r>
+          </w:p>
+        </w:tc>
+        <w:tc>
+          <w:tcPr>
+            <w:tcW w:type="dxa" w:w="2484"/>
+            <w:tcMar>
+              <w:top w:w="90" w:type="dxa"/>
+              <w:bottom w:w="90" w:type="dxa"/>
+              <w:left w:w="120" w:type="dxa"/>
+              <w:right w:w="120" w:type="dxa"/>
+            </w:tcMar>
+          </w:tcPr>
+          <w:p>
+            <w:r>
+              <w:t>Calculates landslide risk (Low, Medium, High, Critical) using live Python AI engine.</w:t>
+            </w:r>
+          </w:p>
+        </w:tc>
+      </w:tr>
+      <w:tr>
+        <w:tc>
+          <w:tcPr>
+            <w:tcW w:type="dxa" w:w="2484"/>
+            <w:tcMar>
+              <w:top w:w="90" w:type="dxa"/>
+              <w:bottom w:w="90" w:type="dxa"/>
+              <w:left w:w="120" w:type="dxa"/>
+              <w:right w:w="120" w:type="dxa"/>
+            </w:tcMar>
+            <w:shd w:val="clear" w:color="auto" w:fill="F1F5F9"/>
+          </w:tcPr>
+          <w:p>
+            <w:r>
+              <w:rPr>
+                <w:b/>
+                <w:color w:val="16A34A"/>
+              </w:rPr>
+              <w:t>POST</w:t>
+            </w:r>
+          </w:p>
+        </w:tc>
+        <w:tc>
+          <w:tcPr>
+            <w:tcW w:type="dxa" w:w="2484"/>
+            <w:tcMar>
+              <w:top w:w="90" w:type="dxa"/>
+              <w:bottom w:w="90" w:type="dxa"/>
+              <w:left w:w="120" w:type="dxa"/>
+              <w:right w:w="120" w:type="dxa"/>
+            </w:tcMar>
+            <w:shd w:val="clear" w:color="auto" w:fill="F1F5F9"/>
+          </w:tcPr>
+          <w:p>
+            <w:r>
+              <w:t>/api/admin/ai-model/predict</w:t>
+            </w:r>
+          </w:p>
+        </w:tc>
+        <w:tc>
+          <w:tcPr>
+            <w:tcW w:type="dxa" w:w="2484"/>
+            <w:tcMar>
+              <w:top w:w="90" w:type="dxa"/>
+              <w:bottom w:w="90" w:type="dxa"/>
+              <w:left w:w="120" w:type="dxa"/>
+              <w:right w:w="120" w:type="dxa"/>
+            </w:tcMar>
+            <w:shd w:val="clear" w:color="auto" w:fill="F1F5F9"/>
+          </w:tcPr>
+          <w:p>
+            <w:r>
+              <w:t>Admin Workbench</w:t>
+            </w:r>
+          </w:p>
+        </w:tc>
+        <w:tc>
+          <w:tcPr>
+            <w:tcW w:type="dxa" w:w="2484"/>
+            <w:tcMar>
+              <w:top w:w="90" w:type="dxa"/>
+              <w:bottom w:w="90" w:type="dxa"/>
+              <w:left w:w="120" w:type="dxa"/>
+              <w:right w:w="120" w:type="dxa"/>
+            </w:tcMar>
+            <w:shd w:val="clear" w:color="auto" w:fill="F1F5F9"/>
+          </w:tcPr>
+          <w:p>
+            <w:r>
+              <w:t>Runs detailed AI prediction with confidence score and geological factors for officers.</w:t>
+            </w:r>
+          </w:p>
+        </w:tc>
+      </w:tr>
+      <w:tr>
+        <w:tc>
+          <w:tcPr>
+            <w:tcW w:type="dxa" w:w="2484"/>
+            <w:tcMar>
+              <w:top w:w="90" w:type="dxa"/>
+              <w:bottom w:w="90" w:type="dxa"/>
+              <w:left w:w="120" w:type="dxa"/>
+              <w:right w:w="120" w:type="dxa"/>
+            </w:tcMar>
+          </w:tcPr>
+          <w:p>
+            <w:r>
+              <w:rPr>
+                <w:b/>
+                <w:color w:val="2563EB"/>
+              </w:rPr>
+              <w:t>GET</w:t>
+            </w:r>
+          </w:p>
+        </w:tc>
+        <w:tc>
+          <w:tcPr>
+            <w:tcW w:type="dxa" w:w="2484"/>
+            <w:tcMar>
+              <w:top w:w="90" w:type="dxa"/>
+              <w:bottom w:w="90" w:type="dxa"/>
+              <w:left w:w="120" w:type="dxa"/>
+              <w:right w:w="120" w:type="dxa"/>
+            </w:tcMar>
+          </w:tcPr>
+          <w:p>
+            <w:r>
+              <w:t>/api/admin/dashboard/stats</w:t>
+            </w:r>
+          </w:p>
+        </w:tc>
+        <w:tc>
+          <w:tcPr>
+            <w:tcW w:type="dxa" w:w="2484"/>
+            <w:tcMar>
+              <w:top w:w="90" w:type="dxa"/>
+              <w:bottom w:w="90" w:type="dxa"/>
+              <w:left w:w="120" w:type="dxa"/>
+              <w:right w:w="120" w:type="dxa"/>
+            </w:tcMar>
+          </w:tcPr>
+          <w:p>
+            <w:r>
+              <w:t>Admin Dashboard</w:t>
+            </w:r>
+          </w:p>
+        </w:tc>
+        <w:tc>
+          <w:tcPr>
+            <w:tcW w:type="dxa" w:w="2484"/>
+            <w:tcMar>
+              <w:top w:w="90" w:type="dxa"/>
+              <w:bottom w:w="90" w:type="dxa"/>
+              <w:left w:w="120" w:type="dxa"/>
+              <w:right w:w="120" w:type="dxa"/>
+            </w:tcMar>
+          </w:tcPr>
+          <w:p>
+            <w:r>
+              <w:t>Gets total counts of monitored slopes, active alerts, and pending reports.</w:t>
+            </w:r>
+          </w:p>
+        </w:tc>
+      </w:tr>
+      <w:tr>
+        <w:tc>
+          <w:tcPr>
+            <w:tcW w:type="dxa" w:w="2484"/>
+            <w:tcMar>
+              <w:top w:w="90" w:type="dxa"/>
+              <w:bottom w:w="90" w:type="dxa"/>
+              <w:left w:w="120" w:type="dxa"/>
+              <w:right w:w="120" w:type="dxa"/>
+            </w:tcMar>
+            <w:shd w:val="clear" w:color="auto" w:fill="F1F5F9"/>
+          </w:tcPr>
+          <w:p>
+            <w:r>
+              <w:rPr>
+                <w:b/>
+                <w:color w:val="D97706"/>
+              </w:rPr>
+              <w:t>PATCH</w:t>
+            </w:r>
+          </w:p>
+        </w:tc>
+        <w:tc>
+          <w:tcPr>
+            <w:tcW w:type="dxa" w:w="2484"/>
+            <w:tcMar>
+              <w:top w:w="90" w:type="dxa"/>
+              <w:bottom w:w="90" w:type="dxa"/>
+              <w:left w:w="120" w:type="dxa"/>
+              <w:right w:w="120" w:type="dxa"/>
+            </w:tcMar>
+            <w:shd w:val="clear" w:color="auto" w:fill="F1F5F9"/>
+          </w:tcPr>
+          <w:p>
+            <w:r>
+              <w:t>/api/admin/reports/:id/verify</w:t>
+            </w:r>
+          </w:p>
+        </w:tc>
+        <w:tc>
+          <w:tcPr>
+            <w:tcW w:type="dxa" w:w="2484"/>
+            <w:tcMar>
+              <w:top w:w="90" w:type="dxa"/>
+              <w:bottom w:w="90" w:type="dxa"/>
+              <w:left w:w="120" w:type="dxa"/>
+              <w:right w:w="120" w:type="dxa"/>
+            </w:tcMar>
+            <w:shd w:val="clear" w:color="auto" w:fill="F1F5F9"/>
+          </w:tcPr>
+          <w:p>
+            <w:r>
+              <w:t>Admin Officers</w:t>
+            </w:r>
+          </w:p>
+        </w:tc>
+        <w:tc>
+          <w:tcPr>
+            <w:tcW w:type="dxa" w:w="2484"/>
+            <w:tcMar>
+              <w:top w:w="90" w:type="dxa"/>
+              <w:bottom w:w="90" w:type="dxa"/>
+              <w:left w:w="120" w:type="dxa"/>
+              <w:right w:w="120" w:type="dxa"/>
+            </w:tcMar>
+            <w:shd w:val="clear" w:color="auto" w:fill="F1F5F9"/>
+          </w:tcPr>
+          <w:p>
+            <w:r>
+              <w:t>Approves (Verify) or declines (Reject) a citizen incident report.</w:t>
+            </w:r>
+          </w:p>
+        </w:tc>
+      </w:tr>
+      <w:tr>
+        <w:tc>
+          <w:tcPr>
+            <w:tcW w:type="dxa" w:w="2484"/>
+            <w:tcMar>
+              <w:top w:w="90" w:type="dxa"/>
+              <w:bottom w:w="90" w:type="dxa"/>
+              <w:left w:w="120" w:type="dxa"/>
+              <w:right w:w="120" w:type="dxa"/>
+            </w:tcMar>
+          </w:tcPr>
+          <w:p>
+            <w:r>
+              <w:rPr>
+                <w:b/>
+                <w:color w:val="16A34A"/>
+              </w:rPr>
+              <w:t>POST</w:t>
+            </w:r>
+          </w:p>
+        </w:tc>
+        <w:tc>
+          <w:tcPr>
+            <w:tcW w:type="dxa" w:w="2484"/>
+            <w:tcMar>
+              <w:top w:w="90" w:type="dxa"/>
+              <w:bottom w:w="90" w:type="dxa"/>
+              <w:left w:w="120" w:type="dxa"/>
+              <w:right w:w="120" w:type="dxa"/>
+            </w:tcMar>
+          </w:tcPr>
+          <w:p>
+            <w:r>
+              <w:t>/api/alerts/send</w:t>
+            </w:r>
+          </w:p>
+        </w:tc>
+        <w:tc>
+          <w:tcPr>
+            <w:tcW w:type="dxa" w:w="2484"/>
+            <w:tcMar>
+              <w:top w:w="90" w:type="dxa"/>
+              <w:bottom w:w="90" w:type="dxa"/>
+              <w:left w:w="120" w:type="dxa"/>
+              <w:right w:w="120" w:type="dxa"/>
+            </w:tcMar>
+          </w:tcPr>
+          <w:p>
+            <w:r>
+              <w:t>Emergency Dispatch</w:t>
+            </w:r>
+          </w:p>
+        </w:tc>
+        <w:tc>
+          <w:tcPr>
+            <w:tcW w:type="dxa" w:w="2484"/>
+            <w:tcMar>
+              <w:top w:w="90" w:type="dxa"/>
+              <w:bottom w:w="90" w:type="dxa"/>
+              <w:left w:w="120" w:type="dxa"/>
+              <w:right w:w="120" w:type="dxa"/>
+            </w:tcMar>
+          </w:tcPr>
+          <w:p>
+            <w:r>
+              <w:t>Sends instant emergency SMS and warning notifications to an affected district.</w:t>
+            </w:r>
+          </w:p>
+        </w:tc>
+      </w:tr>
+    </w:tbl>
     <w:p>
       <w:pPr>
         <w:spacing w:after="240"/>
@@ -1457,617 +1819,265 @@
     </w:p>
     <w:p>
       <w:pPr>
-        <w:pStyle w:val="Heading1"/>
+        <w:spacing w:before="360" w:after="120"/>
       </w:pPr>
       <w:r>
         <w:rPr>
-          <w:color w:val="1B365D"/>
-          <w:sz w:val="32"/>
+          <w:rFonts w:ascii="Calibri" w:hAnsi="Calibri"/>
+          <w:b/>
+          <w:color w:val="1E3A8A"/>
+          <w:sz w:val="30"/>
         </w:rPr>
-        <w:t>5. Database Structure (How Data is Stored)</w:t>
+        <w:t>6. Database Structure &amp; Supabase Setup</w:t>
+      </w:r>
+    </w:p>
+    <w:p>
+      <w:r>
+        <w:t>The project uses Supabase (cloud PostgreSQL database) with 3 simple tables and 1 storage folder:</w:t>
+      </w:r>
+    </w:p>
+    <w:p>
+      <w:pPr>
+        <w:pStyle w:val="ListBullet"/>
+        <w:spacing w:after="60"/>
+      </w:pPr>
+      <w:r>
+        <w:rPr>
+          <w:b/>
+          <w:color w:val="0F172A"/>
+        </w:rPr>
+        <w:t xml:space="preserve">1. public.users table: </w:t>
+      </w:r>
+      <w:r>
+        <w:rPr>
+          <w:color w:val="334155"/>
+        </w:rPr>
+        <w:t>Holds user names, emails, roles ('Admin', 'District Officer', 'Field Agent', 'Citizen'), and phone numbers.</w:t>
+      </w:r>
+    </w:p>
+    <w:p>
+      <w:pPr>
+        <w:pStyle w:val="ListBullet"/>
+        <w:spacing w:after="60"/>
+      </w:pPr>
+      <w:r>
+        <w:rPr>
+          <w:b/>
+          <w:color w:val="0F172A"/>
+        </w:rPr>
+        <w:t xml:space="preserve">2. public.locations table: </w:t>
+      </w:r>
+      <w:r>
+        <w:rPr>
+          <w:color w:val="334155"/>
+        </w:rPr>
+        <w:t>Stores monitored hills across the 8 NE States with GPS coordinates, risk tier (Low to Critical), and description.</w:t>
+      </w:r>
+    </w:p>
+    <w:p>
+      <w:pPr>
+        <w:pStyle w:val="ListBullet"/>
+        <w:spacing w:after="60"/>
+      </w:pPr>
+      <w:r>
+        <w:rPr>
+          <w:b/>
+          <w:color w:val="0F172A"/>
+        </w:rPr>
+        <w:t xml:space="preserve">3. public.reports table: </w:t>
+      </w:r>
+      <w:r>
+        <w:rPr>
+          <w:color w:val="334155"/>
+        </w:rPr>
+        <w:t>Stores all reports submitted by citizens (incident type, GPS, photo URL, severity, status).</w:t>
+      </w:r>
+    </w:p>
+    <w:p>
+      <w:pPr>
+        <w:pStyle w:val="ListBullet"/>
+        <w:spacing w:after="60"/>
+      </w:pPr>
+      <w:r>
+        <w:rPr>
+          <w:b/>
+          <w:color w:val="0F172A"/>
+        </w:rPr>
+        <w:t xml:space="preserve">4. incident-media storage bucket: </w:t>
+      </w:r>
+      <w:r>
+        <w:rPr>
+          <w:color w:val="334155"/>
+        </w:rPr>
+        <w:t>Cloud storage folder where citizen photos and videos are saved up to 50MB with public view access.</w:t>
+      </w:r>
+    </w:p>
+    <w:tbl>
+      <w:tblPr>
+        <w:tblW w:type="auto" w:w="0"/>
+        <w:jc w:val="center"/>
+        <w:tblLook w:firstColumn="1" w:firstRow="1" w:lastColumn="0" w:lastRow="0" w:noHBand="0" w:noVBand="1" w:val="04A0"/>
+      </w:tblPr>
+      <w:tblGrid>
+        <w:gridCol w:w="9936"/>
+      </w:tblGrid>
+      <w:tr>
+        <w:tc>
+          <w:tcPr>
+            <w:tcW w:type="dxa" w:w="9936"/>
+            <w:shd w:val="clear" w:color="auto" w:fill="FEF3C7"/>
+            <w:tcMar>
+              <w:top w:w="140" w:type="dxa"/>
+              <w:bottom w:w="140" w:type="dxa"/>
+              <w:left w:w="200" w:type="dxa"/>
+              <w:right w:w="200" w:type="dxa"/>
+            </w:tcMar>
+          </w:tcPr>
+          <w:p>
+            <w:r>
+              <w:rPr>
+                <w:b/>
+                <w:color w:val="B45309"/>
+              </w:rPr>
+              <w:t xml:space="preserve">How to Setup Database: </w:t>
+            </w:r>
+            <w:r>
+              <w:rPr>
+                <w:color w:val="78350F"/>
+              </w:rPr>
+              <w:t>The complete SQL script to set up all tables and initial sample data is provided in supabase_schema.sql. Simply copy the script and paste it into your Supabase SQL Editor and click 'Run'.</w:t>
+            </w:r>
+          </w:p>
+        </w:tc>
+      </w:tr>
+    </w:tbl>
+    <w:p>
+      <w:pPr>
+        <w:spacing w:after="120"/>
+      </w:pPr>
+    </w:p>
+    <w:p>
+      <w:pPr>
+        <w:spacing w:before="360" w:after="120"/>
+      </w:pPr>
+      <w:r>
+        <w:rPr>
+          <w:rFonts w:ascii="Calibri" w:hAnsi="Calibri"/>
+          <w:b/>
+          <w:color w:val="1E3A8A"/>
+          <w:sz w:val="30"/>
+        </w:rPr>
+        <w:t>7. How to Run the App Locally on Your Computer</w:t>
+      </w:r>
+    </w:p>
+    <w:p>
+      <w:r>
+        <w:t>To start all 3 parts of the platform:</w:t>
+      </w:r>
+    </w:p>
+    <w:p>
+      <w:pPr>
+        <w:spacing w:before="240" w:after="80"/>
+      </w:pPr>
+      <w:r>
+        <w:rPr>
+          <w:rFonts w:ascii="Calibri" w:hAnsi="Calibri"/>
+          <w:b/>
+          <w:color w:val="0F172A"/>
+          <w:sz w:val="25"/>
+        </w:rPr>
+        <w:t>Option A: Quick Start from Project Root (Easiest)</w:t>
+      </w:r>
+    </w:p>
+    <w:p>
+      <w:r>
+        <w:t>Open your terminal in the project folder and run:</w:t>
       </w:r>
     </w:p>
     <w:p>
       <w:r>
         <w:rPr>
+          <w:rFonts w:ascii="Consolas" w:hAnsi="Consolas"/>
           <w:b/>
-          <w:color w:val="2C3E50"/>
+          <w:color w:val="1E293B"/>
         </w:rPr>
-        <w:t xml:space="preserve">1. Users Table: </w:t>
+        <w:t>npm run dev</w:t>
       </w:r>
+    </w:p>
+    <w:p>
       <w:r>
-        <w:t>Stores people who can access the system.</w:t>
+        <w:t>This immediately launches the website at http://localhost:5173.</w:t>
+      </w:r>
+    </w:p>
+    <w:p>
+      <w:pPr>
+        <w:spacing w:before="240" w:after="80"/>
+      </w:pPr>
+      <w:r>
+        <w:rPr>
+          <w:rFonts w:ascii="Calibri" w:hAnsi="Calibri"/>
+          <w:b/>
+          <w:color w:val="0F172A"/>
+          <w:sz w:val="25"/>
+        </w:rPr>
+        <w:t>Option B: Starting Individual Services in Separate Terminals</w:t>
       </w:r>
     </w:p>
     <w:p>
       <w:pPr>
         <w:pStyle w:val="ListBullet"/>
+        <w:spacing w:after="60"/>
       </w:pPr>
       <w:r>
-        <w:t>Name: User's full name.</w:t>
+        <w:rPr>
+          <w:b/>
+          <w:color w:val="0F172A"/>
+        </w:rPr>
+        <w:t xml:space="preserve">Terminal 1 (Backend API): </w:t>
+      </w:r>
+      <w:r>
+        <w:rPr>
+          <w:color w:val="334155"/>
+        </w:rPr>
+        <w:t>cd backend -&gt; npm install -&gt; node server.js (Runs on http://localhost:5000)</w:t>
       </w:r>
     </w:p>
     <w:p>
       <w:pPr>
         <w:pStyle w:val="ListBullet"/>
+        <w:spacing w:after="60"/>
       </w:pPr>
       <w:r>
-        <w:t>Email: Unique login email address.</w:t>
+        <w:rPr>
+          <w:b/>
+          <w:color w:val="0F172A"/>
+        </w:rPr>
+        <w:t xml:space="preserve">Terminal 2 (AI Service): </w:t>
+      </w:r>
+      <w:r>
+        <w:rPr>
+          <w:color w:val="334155"/>
+        </w:rPr>
+        <w:t>cd ml-services -&gt; pip install -r requirements.txt -&gt; uvicorn app.main:app --port 8000 (Runs on http://localhost:8000)</w:t>
       </w:r>
     </w:p>
     <w:p>
       <w:pPr>
         <w:pStyle w:val="ListBullet"/>
-      </w:pPr>
-      <w:r>
-        <w:t>Role: Admin, District Officer, Field Agent, or Citizen.</w:t>
-      </w:r>
-    </w:p>
-    <w:p>
-      <w:pPr>
-        <w:pStyle w:val="ListBullet"/>
-      </w:pPr>
-      <w:r>
-        <w:t>District: District they belong to (e.g., Shillong, Kohima, Aizawl).</w:t>
-      </w:r>
-    </w:p>
-    <w:p>
-      <w:pPr>
-        <w:pStyle w:val="ListBullet"/>
-      </w:pPr>
-      <w:r>
-        <w:t>Status: Active or Inactive.</w:t>
-      </w:r>
-    </w:p>
-    <w:p>
-      <w:r>
-        <w:rPr>
-          <w:b/>
-          <w:color w:val="2C3E50"/>
-        </w:rPr>
-        <w:t xml:space="preserve">2. Locations Table: </w:t>
-      </w:r>
-      <w:r>
-        <w:t>Stores known landslide spots and hills being monitored.</w:t>
-      </w:r>
-    </w:p>
-    <w:p>
-      <w:pPr>
-        <w:pStyle w:val="ListBullet"/>
-      </w:pPr>
-      <w:r>
-        <w:t>Name: Name of the hill, road, or area (e.g., Nongthymmai Ridge).</w:t>
-      </w:r>
-    </w:p>
-    <w:p>
-      <w:pPr>
-        <w:pStyle w:val="ListBullet"/>
-      </w:pPr>
-      <w:r>
-        <w:t>District: District name.</w:t>
-      </w:r>
-    </w:p>
-    <w:p>
-      <w:pPr>
-        <w:pStyle w:val="ListBullet"/>
-      </w:pPr>
-      <w:r>
-        <w:t>Latitude &amp; Longitude: GPS coordinates of the hill.</w:t>
-      </w:r>
-    </w:p>
-    <w:p>
-      <w:pPr>
-        <w:pStyle w:val="ListBullet"/>
-      </w:pPr>
-      <w:r>
-        <w:t>Risk Level: Current danger level (Low, Medium, High, or Critical).</w:t>
-      </w:r>
-    </w:p>
-    <w:p>
-      <w:pPr>
-        <w:pStyle w:val="ListBullet"/>
-      </w:pPr>
-      <w:r>
-        <w:t>Status: Monitored or Resolved.</w:t>
-      </w:r>
-    </w:p>
-    <w:p>
-      <w:r>
-        <w:rPr>
-          <w:b/>
-          <w:color w:val="2C3E50"/>
-        </w:rPr>
-        <w:t xml:space="preserve">3. Reports Table: </w:t>
-      </w:r>
-      <w:r>
-        <w:t>Stores all incident reports submitted by citizens and field agents.</w:t>
-      </w:r>
-    </w:p>
-    <w:p>
-      <w:pPr>
-        <w:pStyle w:val="ListBullet"/>
-      </w:pPr>
-      <w:r>
-        <w:t>Incident Type: Landslide, Slope Crack, Road Blockage, or Flooding.</w:t>
-      </w:r>
-    </w:p>
-    <w:p>
-      <w:pPr>
-        <w:pStyle w:val="ListBullet"/>
-      </w:pPr>
-      <w:r>
-        <w:t>District &amp; GPS: Where the incident occurred.</w:t>
-      </w:r>
-    </w:p>
-    <w:p>
-      <w:pPr>
-        <w:pStyle w:val="ListBullet"/>
-      </w:pPr>
-      <w:r>
-        <w:t>Description: Details written by the citizen.</w:t>
-      </w:r>
-    </w:p>
-    <w:p>
-      <w:pPr>
-        <w:pStyle w:val="ListBullet"/>
-      </w:pPr>
-      <w:r>
-        <w:t>Media URL: Link to uploaded photo or video evidence.</w:t>
-      </w:r>
-    </w:p>
-    <w:p>
-      <w:pPr>
-        <w:pStyle w:val="ListBullet"/>
-      </w:pPr>
-      <w:r>
-        <w:t>Severity: Minor, Moderate, or Severe.</w:t>
-      </w:r>
-    </w:p>
-    <w:p>
-      <w:pPr>
-        <w:pStyle w:val="ListBullet"/>
-      </w:pPr>
-      <w:r>
-        <w:t>Status: Pending, Verified, or Rejected.</w:t>
-      </w:r>
-    </w:p>
-    <w:p>
-      <w:r>
-        <w:rPr>
-          <w:b/>
-          <w:color w:val="2C3E50"/>
-        </w:rPr>
-        <w:t xml:space="preserve">4. Media Storage Bucket (incident-media): </w:t>
-      </w:r>
-      <w:r>
-        <w:t>Cloud storage folder holding citizen evidence.</w:t>
-      </w:r>
-    </w:p>
-    <w:p>
-      <w:pPr>
-        <w:pStyle w:val="ListBullet"/>
-      </w:pPr>
-      <w:r>
-        <w:t>Stores JPEG, PNG, WebP, and MP4 files up to 50MB each.</w:t>
-      </w:r>
-    </w:p>
-    <w:p>
-      <w:r>
-        <w:rPr>
-          <w:b/>
-        </w:rPr>
-        <w:t>How Data Connects in Plain Words:</w:t>
-        <w:br/>
-      </w:r>
-      <w:r>
-        <w:t>• One User can submit multiple Reports over time.</w:t>
-        <w:br/>
-      </w:r>
-      <w:r>
-        <w:t>• Each Report contains GPS coordinates that display on the interactive map.</w:t>
-        <w:br/>
-      </w:r>
-      <w:r>
-        <w:t>• When an officer Verifies a report, status changes from Pending to Verified, triggering emergency alerts.</w:t>
-      </w:r>
-    </w:p>
-    <w:p>
-      <w:pPr>
-        <w:spacing w:after="240"/>
-      </w:pPr>
-    </w:p>
-    <w:p>
-      <w:pPr>
-        <w:pStyle w:val="Heading1"/>
-      </w:pPr>
-      <w:r>
-        <w:rPr>
-          <w:color w:val="1B365D"/>
-          <w:sz w:val="32"/>
-        </w:rPr>
-        <w:t>6. API Reference (Simple &amp; Clear)</w:t>
-      </w:r>
-    </w:p>
-    <w:p>
-      <w:r>
-        <w:rPr>
-          <w:b/>
-          <w:color w:val="1B365D"/>
-          <w:sz w:val="26"/>
-        </w:rPr>
-        <w:t>1. Report APIs</w:t>
-      </w:r>
-    </w:p>
-    <w:p>
-      <w:pPr>
-        <w:pStyle w:val="ListBullet"/>
+        <w:spacing w:after="60"/>
       </w:pPr>
       <w:r>
         <w:rPr>
           <w:b/>
+          <w:color w:val="0F172A"/>
         </w:rPr>
-        <w:t xml:space="preserve">Verify or Reject Report </w:t>
+        <w:t xml:space="preserve">Terminal 3 (Frontend Website): </w:t>
       </w:r>
       <w:r>
-        <w:br/>
-        <w:t xml:space="preserve">  • Link: PATCH /api/admin/reports/:id/verify</w:t>
-        <w:br/>
-        <w:t xml:space="preserve">  • What it does: Approves (Verify) or declines (Reject) a citizen report.</w:t>
-        <w:br/>
-        <w:t xml:space="preserve">  • Extra info: If verified, it automatically triggers emergency alerts to district officers.</w:t>
-      </w:r>
-    </w:p>
-    <w:p>
-      <w:pPr>
-        <w:pStyle w:val="ListBullet"/>
-      </w:pPr>
-      <w:r>
         <w:rPr>
-          <w:b/>
+          <w:color w:val="334155"/>
         </w:rPr>
-        <w:t xml:space="preserve">Citizen Report Notification </w:t>
-      </w:r>
-      <w:r>
-        <w:br/>
-        <w:t xml:space="preserve">  • Link: POST /api/citizen/reports/notify</w:t>
-        <w:br/>
-        <w:t xml:space="preserve">  • What it does: Informs the control room that a citizen just submitted a new report.</w:t>
-        <w:br/>
-        <w:t xml:space="preserve">  • Extra info: Sends an email and notification to the duty desk so they review it quickly.</w:t>
-      </w:r>
-    </w:p>
-    <w:p>
-      <w:r>
-        <w:rPr>
-          <w:b/>
-          <w:color w:val="1B365D"/>
-          <w:sz w:val="26"/>
-        </w:rPr>
-        <w:t>2. AI Risk Prediction API</w:t>
-      </w:r>
-    </w:p>
-    <w:p>
-      <w:pPr>
-        <w:pStyle w:val="ListBullet"/>
-      </w:pPr>
-      <w:r>
-        <w:rPr>
-          <w:b/>
-        </w:rPr>
-        <w:t xml:space="preserve">Calculate Landslide Risk </w:t>
-      </w:r>
-      <w:r>
-        <w:br/>
-        <w:t xml:space="preserve">  • Link: POST /api/admin/ai-model/predict</w:t>
-        <w:br/>
-        <w:t xml:space="preserve">  • What it does: Passes location coordinates and rainfall to AI engine to calculate risk level.</w:t>
-        <w:br/>
-        <w:t xml:space="preserve">  • Extra info: Automatically looks up local rainfall if not provided by user.</w:t>
-      </w:r>
-    </w:p>
-    <w:p>
-      <w:r>
-        <w:rPr>
-          <w:b/>
-          <w:color w:val="1B365D"/>
-          <w:sz w:val="26"/>
-        </w:rPr>
-        <w:t>3. Emergency Alert API</w:t>
-      </w:r>
-    </w:p>
-    <w:p>
-      <w:pPr>
-        <w:pStyle w:val="ListBullet"/>
-      </w:pPr>
-      <w:r>
-        <w:rPr>
-          <w:b/>
-        </w:rPr>
-        <w:t xml:space="preserve">Send District Alert </w:t>
-      </w:r>
-      <w:r>
-        <w:br/>
-        <w:t xml:space="preserve">  • Link: POST /api/alerts/send</w:t>
-        <w:br/>
-        <w:t xml:space="preserve">  • What it does: Broadcasts an emergency SMS and push notification to people in a specific district.</w:t>
-        <w:br/>
-        <w:t xml:space="preserve">  • Extra info: Used when a severe landslide or road blockage occurs.</w:t>
-      </w:r>
-    </w:p>
-    <w:p>
-      <w:r>
-        <w:rPr>
-          <w:b/>
-          <w:color w:val="1B365D"/>
-          <w:sz w:val="26"/>
-        </w:rPr>
-        <w:t>4. Weather API</w:t>
-      </w:r>
-    </w:p>
-    <w:p>
-      <w:pPr>
-        <w:pStyle w:val="ListBullet"/>
-      </w:pPr>
-      <w:r>
-        <w:rPr>
-          <w:b/>
-        </w:rPr>
-        <w:t xml:space="preserve">Get District Weather </w:t>
-      </w:r>
-      <w:r>
-        <w:br/>
-        <w:t xml:space="preserve">  • Link: GET /api/weather/:district</w:t>
-        <w:br/>
-        <w:t xml:space="preserve">  • What it does: Fetches current rainfall in millimeters and a 7-day weather forecast.</w:t>
-        <w:br/>
-        <w:t xml:space="preserve">  • Extra info: Used by both the public home page and the AI prediction engine.</w:t>
-      </w:r>
-    </w:p>
-    <w:p>
-      <w:r>
-        <w:rPr>
-          <w:b/>
-          <w:color w:val="1B365D"/>
-          <w:sz w:val="26"/>
-        </w:rPr>
-        <w:t>5. Dashboard Summary API</w:t>
-      </w:r>
-    </w:p>
-    <w:p>
-      <w:pPr>
-        <w:pStyle w:val="ListBullet"/>
-      </w:pPr>
-      <w:r>
-        <w:rPr>
-          <w:b/>
-        </w:rPr>
-        <w:t xml:space="preserve">Get Dashboard Statistics </w:t>
-      </w:r>
-      <w:r>
-        <w:br/>
-        <w:t xml:space="preserve">  • Link: GET /api/admin/dashboard/stats</w:t>
-        <w:br/>
-        <w:t xml:space="preserve">  • What it does: Provides counts of active locations, pending reports, and risk levels.</w:t>
-        <w:br/>
-        <w:t xml:space="preserve">  • Extra info: Powers summary cards and charts on the admin dashboard.</w:t>
-      </w:r>
-    </w:p>
-    <w:p>
-      <w:r>
-        <w:rPr>
-          <w:b/>
-          <w:color w:val="1B365D"/>
-          <w:sz w:val="26"/>
-        </w:rPr>
-        <w:t>6. System Health API</w:t>
-      </w:r>
-    </w:p>
-    <w:p>
-      <w:pPr>
-        <w:pStyle w:val="ListBullet"/>
-      </w:pPr>
-      <w:r>
-        <w:rPr>
-          <w:b/>
-        </w:rPr>
-        <w:t xml:space="preserve">Check Server Status </w:t>
-      </w:r>
-      <w:r>
-        <w:br/>
-        <w:t xml:space="preserve">  • Link: GET /api/health</w:t>
-        <w:br/>
-        <w:t xml:space="preserve">  • What it does: Confirms that the backend server is running and healthy.</w:t>
-        <w:br/>
-        <w:t xml:space="preserve">  • Extra info: Used for monitoring server uptime.</w:t>
-      </w:r>
-    </w:p>
-    <w:p>
-      <w:pPr>
-        <w:spacing w:after="240"/>
-      </w:pPr>
-    </w:p>
-    <w:p>
-      <w:pPr>
-        <w:pStyle w:val="Heading1"/>
-      </w:pPr>
-      <w:r>
-        <w:rPr>
-          <w:color w:val="1B365D"/>
-          <w:sz w:val="32"/>
-        </w:rPr>
-        <w:t>7. How to Run the Project Locally</w:t>
-      </w:r>
-    </w:p>
-    <w:p>
-      <w:r>
-        <w:rPr>
-          <w:b/>
-          <w:color w:val="2C3E50"/>
-        </w:rPr>
-        <w:t>1. Database Setup</w:t>
-      </w:r>
-    </w:p>
-    <w:p>
-      <w:pPr>
-        <w:pStyle w:val="ListBullet"/>
-      </w:pPr>
-      <w:r>
-        <w:t>Log into your Supabase account.</w:t>
-      </w:r>
-    </w:p>
-    <w:p>
-      <w:pPr>
-        <w:pStyle w:val="ListBullet"/>
-      </w:pPr>
-      <w:r>
-        <w:t>Go to the SQL Editor and paste the code from 'supabase_schema.sql'.</w:t>
-      </w:r>
-    </w:p>
-    <w:p>
-      <w:pPr>
-        <w:pStyle w:val="ListBullet"/>
-      </w:pPr>
-      <w:r>
-        <w:t>Click Run to create the tables, storage bucket, and sample data.</w:t>
-      </w:r>
-    </w:p>
-    <w:p>
-      <w:r>
-        <w:rPr>
-          <w:b/>
-          <w:color w:val="2C3E50"/>
-        </w:rPr>
-        <w:t>2. Start the Backend API (Node.js)</w:t>
-      </w:r>
-    </w:p>
-    <w:p>
-      <w:pPr>
-        <w:pStyle w:val="ListBullet"/>
-      </w:pPr>
-      <w:r>
-        <w:t>Open terminal: cd backend</w:t>
-      </w:r>
-    </w:p>
-    <w:p>
-      <w:pPr>
-        <w:pStyle w:val="ListBullet"/>
-      </w:pPr>
-      <w:r>
-        <w:t>Run: npm install</w:t>
-      </w:r>
-    </w:p>
-    <w:p>
-      <w:pPr>
-        <w:pStyle w:val="ListBullet"/>
-      </w:pPr>
-      <w:r>
-        <w:t>Run: npm run dev</w:t>
-      </w:r>
-    </w:p>
-    <w:p>
-      <w:pPr>
-        <w:pStyle w:val="ListBullet"/>
-      </w:pPr>
-      <w:r>
-        <w:t>Server runs on: http://localhost:5000</w:t>
-      </w:r>
-    </w:p>
-    <w:p>
-      <w:r>
-        <w:rPr>
-          <w:b/>
-          <w:color w:val="2C3E50"/>
-        </w:rPr>
-        <w:t>3. Start the AI Service (Python)</w:t>
-      </w:r>
-    </w:p>
-    <w:p>
-      <w:pPr>
-        <w:pStyle w:val="ListBullet"/>
-      </w:pPr>
-      <w:r>
-        <w:t>Open terminal: cd ml-services</w:t>
-      </w:r>
-    </w:p>
-    <w:p>
-      <w:pPr>
-        <w:pStyle w:val="ListBullet"/>
-      </w:pPr>
-      <w:r>
-        <w:t>Create virtual environment: python -m venv venv</w:t>
-      </w:r>
-    </w:p>
-    <w:p>
-      <w:pPr>
-        <w:pStyle w:val="ListBullet"/>
-      </w:pPr>
-      <w:r>
-        <w:t>Activate: venv\Scripts\activate (Windows) or source venv/bin/activate (Mac/Linux)</w:t>
-      </w:r>
-    </w:p>
-    <w:p>
-      <w:pPr>
-        <w:pStyle w:val="ListBullet"/>
-      </w:pPr>
-      <w:r>
-        <w:t>Install: pip install -r requirements.txt</w:t>
-      </w:r>
-    </w:p>
-    <w:p>
-      <w:pPr>
-        <w:pStyle w:val="ListBullet"/>
-      </w:pPr>
-      <w:r>
-        <w:t>Run: uvicorn app.main:app --reload --port 8000</w:t>
-      </w:r>
-    </w:p>
-    <w:p>
-      <w:pPr>
-        <w:pStyle w:val="ListBullet"/>
-      </w:pPr>
-      <w:r>
-        <w:t>Service runs on: http://localhost:8000</w:t>
-      </w:r>
-    </w:p>
-    <w:p>
-      <w:r>
-        <w:rPr>
-          <w:b/>
-          <w:color w:val="2C3E50"/>
-        </w:rPr>
-        <w:t>4. Start the Frontend Website (React)</w:t>
-      </w:r>
-    </w:p>
-    <w:p>
-      <w:pPr>
-        <w:pStyle w:val="ListBullet"/>
-      </w:pPr>
-      <w:r>
-        <w:t>Open terminal: cd frontend</w:t>
-      </w:r>
-    </w:p>
-    <w:p>
-      <w:pPr>
-        <w:pStyle w:val="ListBullet"/>
-      </w:pPr>
-      <w:r>
-        <w:t>Run: npm install</w:t>
-      </w:r>
-    </w:p>
-    <w:p>
-      <w:pPr>
-        <w:pStyle w:val="ListBullet"/>
-      </w:pPr>
-      <w:r>
-        <w:t>Run: npm run dev</w:t>
-      </w:r>
-    </w:p>
-    <w:p>
-      <w:pPr>
-        <w:pStyle w:val="ListBullet"/>
-      </w:pPr>
-      <w:r>
-        <w:t>Open your browser at: http://localhost:5173</w:t>
+        <w:t>cd frontend -&gt; npm install -&gt; npm run dev (Open http://localhost:5173 in your browser)</w:t>
       </w:r>
     </w:p>
     <w:sectPr>
@@ -2445,7 +2455,7 @@
     <w:rsid w:val="00FC693F"/>
     <w:rPr>
       <w:rFonts w:ascii="Calibri" w:hAnsi="Calibri"/>
-      <w:color w:val="222222"/>
+      <w:color w:val="1E293B"/>
       <w:sz w:val="22"/>
     </w:rPr>
   </w:style>

</xml_diff>